<commit_message>
daily: 2026-10-14 施工单 + 收 A01/A02 作业
昨天（10-13）第一次真的写了代码：A01 / A02 完成，A03 未做。

- present/code/c/A01.c A02.c   他自己的作业，收进来了
- present/daily/2026-10-14.md/.docx  今天的施工单
- .gitignore  补 *.ilk *.pdb *.idb *.exp *.lib 等 MSVC 中间文件，
              以及 ~$* （Word 打开 docx 时生成的锁文件）
- present/progress.md  W3 行 + 会话日志 + 连续打卡天数

发现的问题：A01/A02 是在 Windows 上用 MSVC 编的（code/c/ 里有 .ilk/.pdb/vc140.pdb），
不是任务要求的 WSL gcc。所以 A02 里 long 记成了 4 —— Windows 是 LLP64，Linux 是 LP64。
另外那些 .pdb/.ilk 加起来 22MB，差一条 git add . 就推进公开仓库了。
</commit_message>
<xml_diff>
--- a/present/daily/2026-10-13.docx
+++ b/present/daily/2026-10-13.docx
@@ -1,84 +1,93 @@
 
 <file path=word/document.xml><?xml version="1.0" encoding="utf-8"?>
-<w:document xmlns:w="http://schemas.openxmlformats.org/wordprocessingml/2006/main">
+<w:document xmlns:wpc="http://schemas.microsoft.com/office/word/2010/wordprocessingCanvas" xmlns:cx="http://schemas.microsoft.com/office/drawing/2014/chartex" xmlns:cx1="http://schemas.microsoft.com/office/drawing/2015/9/8/chartex" xmlns:cx2="http://schemas.microsoft.com/office/drawing/2015/10/21/chartex" xmlns:cx3="http://schemas.microsoft.com/office/drawing/2016/5/9/chartex" xmlns:cx4="http://schemas.microsoft.com/office/drawing/2016/5/10/chartex" xmlns:cx5="http://schemas.microsoft.com/office/drawing/2016/5/11/chartex" xmlns:cx6="http://schemas.microsoft.com/office/drawing/2016/5/12/chartex" xmlns:cx7="http://schemas.microsoft.com/office/drawing/2016/5/13/chartex" xmlns:cx8="http://schemas.microsoft.com/office/drawing/2016/5/14/chartex" xmlns:mc="http://schemas.openxmlformats.org/markup-compatibility/2006" xmlns:o="urn:schemas-microsoft-com:office:office" xmlns:r="http://schemas.openxmlformats.org/officeDocument/2006/relationships" xmlns:m="http://schemas.openxmlformats.org/officeDocument/2006/math" xmlns:v="urn:schemas-microsoft-com:vml" xmlns:wp14="http://schemas.microsoft.com/office/word/2010/wordprocessingDrawing" xmlns:wp="http://schemas.openxmlformats.org/drawingml/2006/wordprocessingDrawing" xmlns:w="http://schemas.openxmlformats.org/wordprocessingml/2006/main" xmlns:w14="http://schemas.microsoft.com/office/word/2010/wordml" xmlns:w10="urn:schemas-microsoft-com:office:word" xmlns:w15="http://schemas.microsoft.com/office/word/2012/wordml" xmlns:wpg="http://schemas.microsoft.com/office/word/2010/wordprocessingGroup" xmlns:wpi="http://schemas.microsoft.com/office/word/2010/wordprocessingInk" xmlns:wne="http://schemas.microsoft.com/office/word/2006/wordml" xmlns:wps="http://schemas.microsoft.com/office/word/2010/wordprocessingShape" xmlns:wpsCustomData="http://www.wps.cn/officeDocument/2013/wpsCustomData" mc:Ignorable="w14 w15 wp14">
   <w:body>
     <w:p>
       <w:pPr>
-        <w:pStyle w:val="Heading1"/>
-      </w:pPr>
-      <w:r>
-        <w:t xml:space="preserve">2026-10-13（周二）· Day 1</w:t>
-      </w:r>
-    </w:p>
-    <w:p>
-      <w:pPr>
-        <w:pStyle w:val="Quote"/>
+        <w:pStyle w:val="2"/>
+      </w:pPr>
+      <w:r>
+        <w:t>2026-10-13（周二）· Day 1</w:t>
+      </w:r>
+    </w:p>
+    <w:p>
+      <w:pPr>
+        <w:pStyle w:val="7"/>
       </w:pPr>
       <w:r>
         <w:rPr>
           <w:b/>
         </w:rPr>
-        <w:t xml:space="preserve">今天的任务不是「学 C 语言」，是「把 C 语言写出来」。</w:t>
-      </w:r>
-    </w:p>
-    <w:p>
-      <w:pPr>
-        <w:pStyle w:val="Quote"/>
-      </w:pPr>
-      <w:r>
-        <w:t xml:space="preserve">不看视频，不读书。查资料单次不超过 5 分钟，查不到就贴报错来问我。</w:t>
-      </w:r>
-    </w:p>
-    <w:p>
-      <w:pPr>
-        <w:pStyle w:val="Quote"/>
-      </w:pPr>
-      <w:r>
-        <w:t xml:space="preserve">目标时长 110 分钟。做不完三道就做两道，</w:t>
+        <w:t>今天的任务不是「学 C 语言」，是「把 C 语言写出来」。</w:t>
+      </w:r>
+    </w:p>
+    <w:p>
+      <w:pPr>
+        <w:pStyle w:val="7"/>
+      </w:pPr>
+      <w:r>
+        <w:t>不看视频，不读书。查资料单次不超过 5 分钟，查不到就贴报错来问我。</w:t>
+      </w:r>
+    </w:p>
+    <w:p>
+      <w:pPr>
+        <w:pStyle w:val="7"/>
+      </w:pPr>
+      <w:r>
+        <w:t>目标时长 110 分钟。做不完三道就做两道，</w:t>
       </w:r>
       <w:r>
         <w:rPr>
           <w:b/>
         </w:rPr>
-        <w:t xml:space="preserve">不要跳着做</w:t>
-      </w:r>
-      <w:r>
-        <w:t xml:space="preserve">。</w:t>
-      </w:r>
-    </w:p>
-    <w:p>
-      <w:pPr>
-        <w:pStyle w:val="HR"/>
-      </w:pPr>
-      <w:r>
-        <w:t xml:space="preserve"/>
-      </w:r>
-    </w:p>
-    <w:p>
-      <w:pPr>
-        <w:pStyle w:val="Heading2"/>
-      </w:pPr>
-      <w:r>
-        <w:t xml:space="preserve">0 · 开工前（5 分钟）</w:t>
-      </w:r>
-    </w:p>
-    <w:p>
-      <w:r>
-        <w:t xml:space="preserve">打开终端（PowerShell 或 Git Bash 都行），进 WSL 并到工作目录：</w:t>
-      </w:r>
-    </w:p>
-    <w:p>
-      <w:pPr>
-        <w:pStyle w:val="Code"/>
-      </w:pPr>
-      <w:r>
-        <w:t xml:space="preserve">wsl -d Ubuntu</w:t>
-        <w:br/>
-        <w:t xml:space="preserve">cd "/mnt/d/Claude_code/职业规划导师/present/code/c"</w:t>
-        <w:br/>
-        <w:t xml:space="preserve">mkdir -p build</w:t>
-        <w:br/>
-        <w:t xml:space="preserve">gcc --version</w:t>
+        <w:t>不要跳着做</w:t>
+      </w:r>
+      <w:r>
+        <w:t>。</w:t>
+      </w:r>
+    </w:p>
+    <w:p>
+      <w:pPr>
+        <w:pStyle w:val="11"/>
+      </w:pPr>
+    </w:p>
+    <w:p>
+      <w:pPr>
+        <w:pStyle w:val="3"/>
+      </w:pPr>
+      <w:r>
+        <w:t>0 · 开工前（5 分钟）</w:t>
+      </w:r>
+    </w:p>
+    <w:p>
+      <w:r>
+        <w:t>打开终端（PowerShell 或 Git Bash 都行），进 WSL 并到工作目录：</w:t>
+      </w:r>
+    </w:p>
+    <w:p>
+      <w:pPr>
+        <w:pStyle w:val="8"/>
+      </w:pPr>
+      <w:r>
+        <w:t>wsl -d Ubuntu</w:t>
+      </w:r>
+      <w:r>
+        <w:br w:type="textWrapping"/>
+      </w:r>
+      <w:r>
+        <w:t>cd "/mnt/d/Claude_code/职业规划导师/present/code/c"</w:t>
+      </w:r>
+      <w:r>
+        <w:br w:type="textWrapping"/>
+      </w:r>
+      <w:r>
+        <w:t>mkdir -p build</w:t>
+      </w:r>
+      <w:r>
+        <w:br w:type="textWrapping"/>
+      </w:r>
+      <w:r>
+        <w:t>gcc --version</w:t>
       </w:r>
     </w:p>
     <w:p>
@@ -91,21 +100,21 @@
           <w:sz w:val="19"/>
           <w:szCs w:val="19"/>
         </w:rPr>
-        <w:t xml:space="preserve">gcc (Ubuntu 11.4.0-1ubuntu1~22.04.3) 11.4.0</w:t>
-      </w:r>
-      <w:r>
-        <w:t xml:space="preserve">。看到版本号就往下走。</w:t>
-      </w:r>
-    </w:p>
-    <w:p>
-      <w:pPr>
-        <w:pStyle w:val="Quote"/>
+        <w:t>gcc (Ubuntu 11.4.0-1ubuntu1~22.04.3) 11.4.0</w:t>
+      </w:r>
+      <w:r>
+        <w:t>。看到版本号就往下走。</w:t>
+      </w:r>
+    </w:p>
+    <w:p>
+      <w:pPr>
+        <w:pStyle w:val="7"/>
       </w:pPr>
       <w:r>
         <w:rPr>
           <w:b/>
         </w:rPr>
-        <w:t xml:space="preserve">今天所有题目的编译命令都是同一个套路</w:t>
+        <w:t>今天所有题目的编译命令都是同一个套路</w:t>
       </w:r>
       <w:r>
         <w:t xml:space="preserve">（只把 </w:t>
@@ -116,7 +125,7 @@
           <w:sz w:val="19"/>
           <w:szCs w:val="19"/>
         </w:rPr>
-        <w:t xml:space="preserve">A01</w:t>
+        <w:t>A01</w:t>
       </w:r>
       <w:r>
         <w:t xml:space="preserve"> 换成题号）：</w:t>
@@ -124,57 +133,51 @@
     </w:p>
     <w:p>
       <w:pPr>
-        <w:pStyle w:val="Quote"/>
-      </w:pPr>
-      <w:r>
-        <w:t xml:space="preserve"/>
-      </w:r>
-    </w:p>
-    <w:p>
-      <w:pPr>
-        <w:pStyle w:val="Quote"/>
-      </w:pPr>
-      <w:r>
-        <w:rPr>
-          <w:rFonts w:ascii="Consolas" w:hAnsi="Consolas"/>
-          <w:sz w:val="19"/>
-          <w:szCs w:val="19"/>
-        </w:rPr>
-        <w:t xml:space="preserve">`</w:t>
-      </w:r>
-    </w:p>
-    <w:p>
-      <w:pPr>
-        <w:pStyle w:val="Quote"/>
-      </w:pPr>
-      <w:r>
-        <w:t xml:space="preserve">gcc -Wall -Wextra -Werror -o build/A01 A01.c &amp;&amp; ./build/A01</w:t>
-      </w:r>
-    </w:p>
-    <w:p>
-      <w:pPr>
-        <w:pStyle w:val="Quote"/>
-      </w:pPr>
-      <w:r>
-        <w:rPr>
-          <w:rFonts w:ascii="Consolas" w:hAnsi="Consolas"/>
-          <w:sz w:val="19"/>
-          <w:szCs w:val="19"/>
-        </w:rPr>
-        <w:t xml:space="preserve">`</w:t>
-      </w:r>
-    </w:p>
-    <w:p>
-      <w:pPr>
-        <w:pStyle w:val="Quote"/>
-      </w:pPr>
-      <w:r>
-        <w:t xml:space="preserve"/>
-      </w:r>
-    </w:p>
-    <w:p>
-      <w:pPr>
-        <w:pStyle w:val="Quote"/>
+        <w:pStyle w:val="7"/>
+      </w:pPr>
+    </w:p>
+    <w:p>
+      <w:pPr>
+        <w:pStyle w:val="7"/>
+      </w:pPr>
+      <w:r>
+        <w:rPr>
+          <w:rFonts w:ascii="Consolas" w:hAnsi="Consolas"/>
+          <w:sz w:val="19"/>
+          <w:szCs w:val="19"/>
+        </w:rPr>
+        <w:t>`</w:t>
+      </w:r>
+    </w:p>
+    <w:p>
+      <w:pPr>
+        <w:pStyle w:val="7"/>
+      </w:pPr>
+      <w:r>
+        <w:t>gcc -Wall -Wextra -Werror -o build/A01 A01.c &amp;&amp; ./build/A01</w:t>
+      </w:r>
+    </w:p>
+    <w:p>
+      <w:pPr>
+        <w:pStyle w:val="7"/>
+      </w:pPr>
+      <w:r>
+        <w:rPr>
+          <w:rFonts w:ascii="Consolas" w:hAnsi="Consolas"/>
+          <w:sz w:val="19"/>
+          <w:szCs w:val="19"/>
+        </w:rPr>
+        <w:t>`</w:t>
+      </w:r>
+    </w:p>
+    <w:p>
+      <w:pPr>
+        <w:pStyle w:val="7"/>
+      </w:pPr>
+    </w:p>
+    <w:p>
+      <w:pPr>
+        <w:pStyle w:val="7"/>
       </w:pPr>
       <w:r>
         <w:t xml:space="preserve">可执行文件输出到 </w:t>
@@ -185,7 +188,7 @@
           <w:sz w:val="19"/>
           <w:szCs w:val="19"/>
         </w:rPr>
-        <w:t xml:space="preserve">build/</w:t>
+        <w:t>build/</w:t>
       </w:r>
       <w:r>
         <w:t xml:space="preserve">，是因为那里已经在 </w:t>
@@ -196,7 +199,7 @@
           <w:sz w:val="19"/>
           <w:szCs w:val="19"/>
         </w:rPr>
-        <w:t xml:space="preserve">.gitignore</w:t>
+        <w:t>.gitignore</w:t>
       </w:r>
       <w:r>
         <w:t xml:space="preserve"> 里 —— 不然一个没有扩展名的可执行文件会被提交进仓库。</w:t>
@@ -204,15 +207,15 @@
     </w:p>
     <w:p>
       <w:pPr>
-        <w:pStyle w:val="Quote"/>
-      </w:pPr>
-      <w:r>
-        <w:rPr>
-          <w:rFonts w:ascii="Consolas" w:hAnsi="Consolas"/>
-          <w:sz w:val="19"/>
-          <w:szCs w:val="19"/>
-        </w:rPr>
-        <w:t xml:space="preserve">&amp;&amp;</w:t>
+        <w:pStyle w:val="7"/>
+      </w:pPr>
+      <w:r>
+        <w:rPr>
+          <w:rFonts w:ascii="Consolas" w:hAnsi="Consolas"/>
+          <w:sz w:val="19"/>
+          <w:szCs w:val="19"/>
+        </w:rPr>
+        <w:t>&amp;&amp;</w:t>
       </w:r>
       <w:r>
         <w:t xml:space="preserve"> 的意思是「编译成功了才运行」，这样编译失败时不会去跑一个旧的二进制。</w:t>
@@ -220,18 +223,15 @@
     </w:p>
     <w:p>
       <w:pPr>
-        <w:pStyle w:val="HR"/>
-      </w:pPr>
-      <w:r>
-        <w:t xml:space="preserve"/>
-      </w:r>
-    </w:p>
-    <w:p>
-      <w:pPr>
-        <w:pStyle w:val="Heading2"/>
-      </w:pPr>
-      <w:r>
-        <w:t xml:space="preserve">1 · A01 · 第一个程序，然后故意搞坏它</w:t>
+        <w:pStyle w:val="11"/>
+      </w:pPr>
+    </w:p>
+    <w:p>
+      <w:pPr>
+        <w:pStyle w:val="3"/>
+      </w:pPr>
+      <w:r>
+        <w:t>1 · A01 · 第一个程序，然后故意搞坏它</w:t>
       </w:r>
     </w:p>
     <w:p>
@@ -239,15 +239,15 @@
         <w:rPr>
           <w:b/>
         </w:rPr>
-        <w:t xml:space="preserve">40 分钟 ｜ 文件：`present/code/c/A01.c`</w:t>
-      </w:r>
-    </w:p>
-    <w:p>
-      <w:pPr>
-        <w:pStyle w:val="Heading3"/>
-      </w:pPr>
-      <w:r>
-        <w:t xml:space="preserve">第一步：先写对</w:t>
+        <w:t>40 分钟 ｜ 文件：`present/code/c/A01.c`</w:t>
+      </w:r>
+    </w:p>
+    <w:p>
+      <w:pPr>
+        <w:pStyle w:val="4"/>
+      </w:pPr>
+      <w:r>
+        <w:t>第一步：先写对</w:t>
       </w:r>
     </w:p>
     <w:p>
@@ -260,7 +260,7 @@
           <w:sz w:val="19"/>
           <w:szCs w:val="19"/>
         </w:rPr>
-        <w:t xml:space="preserve">D:\Claude_code\职业规划导师\present\code\c\</w:t>
+        <w:t>D:\Claude_code\职业规划导师\present\code\c\</w:t>
       </w:r>
       <w:r>
         <w:t xml:space="preserve">，新建 </w:t>
@@ -271,23 +271,26 @@
           <w:sz w:val="19"/>
           <w:szCs w:val="19"/>
         </w:rPr>
-        <w:t xml:space="preserve">A01.c</w:t>
-      </w:r>
-      <w:r>
-        <w:t xml:space="preserve">，让程序输出三行：</w:t>
+        <w:t>A01.c</w:t>
+      </w:r>
+      <w:r>
+        <w:t>，让程序输出三行：</w:t>
       </w:r>
     </w:p>
     <w:tbl>
       <w:tblPr>
+        <w:tblStyle w:val="5"/>
         <w:tblW w:w="9000" w:type="dxa"/>
+        <w:tblInd w:w="0" w:type="dxa"/>
         <w:tblBorders>
-          <w:top w:val="single" w:sz="4" w:space="0" w:color="BFBFBF"/>
-          <w:left w:val="single" w:sz="4" w:space="0" w:color="BFBFBF"/>
-          <w:bottom w:val="single" w:sz="4" w:space="0" w:color="BFBFBF"/>
-          <w:right w:val="single" w:sz="4" w:space="0" w:color="BFBFBF"/>
-          <w:insideH w:val="single" w:sz="4" w:space="0" w:color="BFBFBF"/>
-          <w:insideV w:val="single" w:sz="4" w:space="0" w:color="BFBFBF"/>
+          <w:top w:val="single" w:color="BFBFBF" w:sz="4" w:space="0"/>
+          <w:left w:val="single" w:color="BFBFBF" w:sz="4" w:space="0"/>
+          <w:bottom w:val="single" w:color="BFBFBF" w:sz="4" w:space="0"/>
+          <w:right w:val="single" w:color="BFBFBF" w:sz="4" w:space="0"/>
+          <w:insideH w:val="single" w:color="BFBFBF" w:sz="4" w:space="0"/>
+          <w:insideV w:val="single" w:color="BFBFBF" w:sz="4" w:space="0"/>
         </w:tblBorders>
+        <w:tblLayout w:type="autofit"/>
         <w:tblCellMar>
           <w:top w:w="60" w:type="dxa"/>
           <w:left w:w="90" w:type="dxa"/>
@@ -300,6 +303,16 @@
         <w:gridCol w:w="4500"/>
       </w:tblGrid>
       <w:tr>
+        <w:tblPrEx>
+          <w:tblBorders>
+            <w:top w:val="single" w:color="BFBFBF" w:sz="4" w:space="0"/>
+            <w:left w:val="single" w:color="BFBFBF" w:sz="4" w:space="0"/>
+            <w:bottom w:val="single" w:color="BFBFBF" w:sz="4" w:space="0"/>
+            <w:right w:val="single" w:color="BFBFBF" w:sz="4" w:space="0"/>
+            <w:insideH w:val="single" w:color="BFBFBF" w:sz="4" w:space="0"/>
+            <w:insideV w:val="single" w:color="BFBFBF" w:sz="4" w:space="0"/>
+          </w:tblBorders>
+        </w:tblPrEx>
         <w:trPr>
           <w:tblHeader/>
         </w:trPr>
@@ -317,7 +330,7 @@
               <w:rPr>
                 <w:b/>
               </w:rPr>
-              <w:t xml:space="preserve">行</w:t>
+              <w:t>行</w:t>
             </w:r>
           </w:p>
         </w:tc>
@@ -335,12 +348,28 @@
               <w:rPr>
                 <w:b/>
               </w:rPr>
-              <w:t xml:space="preserve">输出什么</w:t>
+              <w:t>输出什么</w:t>
             </w:r>
           </w:p>
         </w:tc>
       </w:tr>
       <w:tr>
+        <w:tblPrEx>
+          <w:tblBorders>
+            <w:top w:val="single" w:color="BFBFBF" w:sz="4" w:space="0"/>
+            <w:left w:val="single" w:color="BFBFBF" w:sz="4" w:space="0"/>
+            <w:bottom w:val="single" w:color="BFBFBF" w:sz="4" w:space="0"/>
+            <w:right w:val="single" w:color="BFBFBF" w:sz="4" w:space="0"/>
+            <w:insideH w:val="single" w:color="BFBFBF" w:sz="4" w:space="0"/>
+            <w:insideV w:val="single" w:color="BFBFBF" w:sz="4" w:space="0"/>
+          </w:tblBorders>
+          <w:tblCellMar>
+            <w:top w:w="60" w:type="dxa"/>
+            <w:left w:w="90" w:type="dxa"/>
+            <w:bottom w:w="60" w:type="dxa"/>
+            <w:right w:w="90" w:type="dxa"/>
+          </w:tblCellMar>
+        </w:tblPrEx>
         <w:tc>
           <w:tcPr>
             <w:tcW w:w="4500" w:type="dxa"/>
@@ -351,7 +380,7 @@
               <w:spacing w:before="30" w:after="30" w:line="260" w:lineRule="auto"/>
             </w:pPr>
             <w:r>
-              <w:t xml:space="preserve">第 1 行</w:t>
+              <w:t>第 1 行</w:t>
             </w:r>
           </w:p>
         </w:tc>
@@ -365,21 +394,37 @@
               <w:spacing w:before="30" w:after="30" w:line="260" w:lineRule="auto"/>
             </w:pPr>
             <w:r>
-              <w:t xml:space="preserve">学号后四位（</w:t>
+              <w:t>学号后四位（</w:t>
             </w:r>
             <w:r>
               <w:rPr>
                 <w:b/>
               </w:rPr>
-              <w:t xml:space="preserve">别写真实姓名 / 手机号</w:t>
-            </w:r>
-            <w:r>
-              <w:t xml:space="preserve">，这是公开仓库）</w:t>
+              <w:t>别写真实姓名 / 手机号</w:t>
+            </w:r>
+            <w:r>
+              <w:t>，这是公开仓库）</w:t>
             </w:r>
           </w:p>
         </w:tc>
       </w:tr>
       <w:tr>
+        <w:tblPrEx>
+          <w:tblBorders>
+            <w:top w:val="single" w:color="BFBFBF" w:sz="4" w:space="0"/>
+            <w:left w:val="single" w:color="BFBFBF" w:sz="4" w:space="0"/>
+            <w:bottom w:val="single" w:color="BFBFBF" w:sz="4" w:space="0"/>
+            <w:right w:val="single" w:color="BFBFBF" w:sz="4" w:space="0"/>
+            <w:insideH w:val="single" w:color="BFBFBF" w:sz="4" w:space="0"/>
+            <w:insideV w:val="single" w:color="BFBFBF" w:sz="4" w:space="0"/>
+          </w:tblBorders>
+          <w:tblCellMar>
+            <w:top w:w="60" w:type="dxa"/>
+            <w:left w:w="90" w:type="dxa"/>
+            <w:bottom w:w="60" w:type="dxa"/>
+            <w:right w:w="90" w:type="dxa"/>
+          </w:tblCellMar>
+        </w:tblPrEx>
         <w:tc>
           <w:tcPr>
             <w:tcW w:w="4500" w:type="dxa"/>
@@ -390,7 +435,7 @@
               <w:spacing w:before="30" w:after="30" w:line="260" w:lineRule="auto"/>
             </w:pPr>
             <w:r>
-              <w:t xml:space="preserve">第 2 行</w:t>
+              <w:t>第 2 行</w:t>
             </w:r>
           </w:p>
         </w:tc>
@@ -412,12 +457,28 @@
                 <w:sz w:val="19"/>
                 <w:szCs w:val="19"/>
               </w:rPr>
-              <w:t xml:space="preserve">2026-10-13</w:t>
+              <w:t>2026-10-13</w:t>
             </w:r>
           </w:p>
         </w:tc>
       </w:tr>
       <w:tr>
+        <w:tblPrEx>
+          <w:tblBorders>
+            <w:top w:val="single" w:color="BFBFBF" w:sz="4" w:space="0"/>
+            <w:left w:val="single" w:color="BFBFBF" w:sz="4" w:space="0"/>
+            <w:bottom w:val="single" w:color="BFBFBF" w:sz="4" w:space="0"/>
+            <w:right w:val="single" w:color="BFBFBF" w:sz="4" w:space="0"/>
+            <w:insideH w:val="single" w:color="BFBFBF" w:sz="4" w:space="0"/>
+            <w:insideV w:val="single" w:color="BFBFBF" w:sz="4" w:space="0"/>
+          </w:tblBorders>
+          <w:tblCellMar>
+            <w:top w:w="60" w:type="dxa"/>
+            <w:left w:w="90" w:type="dxa"/>
+            <w:bottom w:w="60" w:type="dxa"/>
+            <w:right w:w="90" w:type="dxa"/>
+          </w:tblCellMar>
+        </w:tblPrEx>
         <w:tc>
           <w:tcPr>
             <w:tcW w:w="4500" w:type="dxa"/>
@@ -428,7 +489,7 @@
               <w:spacing w:before="30" w:after="30" w:line="260" w:lineRule="auto"/>
             </w:pPr>
             <w:r>
-              <w:t xml:space="preserve">第 3 行</w:t>
+              <w:t>第 3 行</w:t>
             </w:r>
           </w:p>
         </w:tc>
@@ -450,7 +511,7 @@
                 <w:sz w:val="19"/>
                 <w:szCs w:val="19"/>
               </w:rPr>
-              <w:t xml:space="preserve">%d</w:t>
+              <w:t>%d</w:t>
             </w:r>
             <w:r>
               <w:t xml:space="preserve"> 算出并输出 </w:t>
@@ -461,7 +522,7 @@
                 <w:sz w:val="19"/>
                 <w:szCs w:val="19"/>
               </w:rPr>
-              <w:t xml:space="preserve">1 + 2</w:t>
+              <w:t>1 + 2</w:t>
             </w:r>
             <w:r>
               <w:t xml:space="preserve"> 的结果（不是直接把 3 写进格式串）</w:t>
@@ -472,25 +533,25 @@
     </w:tbl>
     <w:p>
       <w:r>
-        <w:t xml:space="preserve">编译、运行、看到三行输出为止。</w:t>
-      </w:r>
-    </w:p>
-    <w:p>
-      <w:pPr>
-        <w:pStyle w:val="Heading3"/>
-      </w:pPr>
-      <w:r>
-        <w:t xml:space="preserve">第二步：故意搞坏它 —— 这一步才是重点</w:t>
-      </w:r>
-    </w:p>
-    <w:p>
-      <w:r>
-        <w:t xml:space="preserve">把 printf 的格式串改坏一次，随便挑一种：</w:t>
-      </w:r>
-    </w:p>
-    <w:p>
-      <w:pPr>
-        <w:pStyle w:val="Bullet"/>
+        <w:t>编译、运行、看到三行输出为止。</w:t>
+      </w:r>
+    </w:p>
+    <w:p>
+      <w:pPr>
+        <w:pStyle w:val="4"/>
+      </w:pPr>
+      <w:r>
+        <w:t>第二步：故意搞坏它 —— 这一步才是重点</w:t>
+      </w:r>
+    </w:p>
+    <w:p>
+      <w:r>
+        <w:t>把 printf 的格式串改坏一次，随便挑一种：</w:t>
+      </w:r>
+    </w:p>
+    <w:p>
+      <w:pPr>
+        <w:pStyle w:val="10"/>
       </w:pPr>
       <w:r>
         <w:t xml:space="preserve">•  在格式串末尾留一个孤零零的 </w:t>
@@ -501,12 +562,12 @@
           <w:sz w:val="19"/>
           <w:szCs w:val="19"/>
         </w:rPr>
-        <w:t xml:space="preserve">%</w:t>
-      </w:r>
-    </w:p>
-    <w:p>
-      <w:pPr>
-        <w:pStyle w:val="Bullet"/>
+        <w:t>%</w:t>
+      </w:r>
+    </w:p>
+    <w:p>
+      <w:pPr>
+        <w:pStyle w:val="10"/>
       </w:pPr>
       <w:r>
         <w:t xml:space="preserve">•  把某个 </w:t>
@@ -517,7 +578,7 @@
           <w:sz w:val="19"/>
           <w:szCs w:val="19"/>
         </w:rPr>
-        <w:t xml:space="preserve">%d</w:t>
+        <w:t>%d</w:t>
       </w:r>
       <w:r>
         <w:t xml:space="preserve"> 换成 </w:t>
@@ -528,70 +589,70 @@
           <w:sz w:val="19"/>
           <w:szCs w:val="19"/>
         </w:rPr>
-        <w:t xml:space="preserve">%s</w:t>
-      </w:r>
-    </w:p>
-    <w:p>
-      <w:pPr>
-        <w:pStyle w:val="Bullet"/>
-      </w:pPr>
-      <w:r>
-        <w:t xml:space="preserve">•  少写一个双引号</w:t>
-      </w:r>
-    </w:p>
-    <w:p>
-      <w:r>
-        <w:t xml:space="preserve">保存，</w:t>
+        <w:t>%s</w:t>
+      </w:r>
+    </w:p>
+    <w:p>
+      <w:pPr>
+        <w:pStyle w:val="10"/>
+      </w:pPr>
+      <w:r>
+        <w:t>•  少写一个双引号</w:t>
+      </w:r>
+    </w:p>
+    <w:p>
+      <w:r>
+        <w:t>保存，</w:t>
       </w:r>
       <w:r>
         <w:rPr>
           <w:b/>
         </w:rPr>
-        <w:t xml:space="preserve">不要修</w:t>
-      </w:r>
-      <w:r>
-        <w:t xml:space="preserve">，重新编译。把 gcc 吐出来的整段报错</w:t>
+        <w:t>不要修</w:t>
+      </w:r>
+      <w:r>
+        <w:t>，重新编译。把 gcc 吐出来的整段报错</w:t>
       </w:r>
       <w:r>
         <w:rPr>
           <w:b/>
         </w:rPr>
-        <w:t xml:space="preserve">看满 30 秒</w:t>
-      </w:r>
-      <w:r>
-        <w:t xml:space="preserve">。</w:t>
-      </w:r>
-    </w:p>
-    <w:p>
-      <w:pPr>
-        <w:pStyle w:val="Heading3"/>
-      </w:pPr>
-      <w:r>
-        <w:t xml:space="preserve">做完要在心里能回答</w:t>
-      </w:r>
-    </w:p>
-    <w:p>
-      <w:r>
-        <w:t xml:space="preserve">1. 报错长这样：</w:t>
-      </w:r>
-      <w:r>
-        <w:rPr>
-          <w:rFonts w:ascii="Consolas" w:hAnsi="Consolas"/>
-          <w:sz w:val="19"/>
-          <w:szCs w:val="19"/>
-        </w:rPr>
-        <w:t xml:space="preserve">A01.c:7:5: error: ...</w:t>
-      </w:r>
-      <w:r>
-        <w:t xml:space="preserve">。</w:t>
-      </w:r>
-      <w:r>
-        <w:rPr>
-          <w:rFonts w:ascii="Consolas" w:hAnsi="Consolas"/>
-          <w:sz w:val="19"/>
-          <w:szCs w:val="19"/>
-        </w:rPr>
-        <w:t xml:space="preserve">A01.c</w:t>
+        <w:t>看满 30 秒</w:t>
+      </w:r>
+      <w:r>
+        <w:t>。</w:t>
+      </w:r>
+    </w:p>
+    <w:p>
+      <w:pPr>
+        <w:pStyle w:val="4"/>
+      </w:pPr>
+      <w:r>
+        <w:t>做完要在心里能回答</w:t>
+      </w:r>
+    </w:p>
+    <w:p>
+      <w:r>
+        <w:t>1. 报错长这样：</w:t>
+      </w:r>
+      <w:r>
+        <w:rPr>
+          <w:rFonts w:ascii="Consolas" w:hAnsi="Consolas"/>
+          <w:sz w:val="19"/>
+          <w:szCs w:val="19"/>
+        </w:rPr>
+        <w:t>A01.c:7:5: error: ...</w:t>
+      </w:r>
+      <w:r>
+        <w:t>。</w:t>
+      </w:r>
+      <w:r>
+        <w:rPr>
+          <w:rFonts w:ascii="Consolas" w:hAnsi="Consolas"/>
+          <w:sz w:val="19"/>
+          <w:szCs w:val="19"/>
+        </w:rPr>
+        <w:t>A01.c</w:t>
       </w:r>
       <w:r>
         <w:t xml:space="preserve"> / </w:t>
@@ -602,7 +663,7 @@
           <w:sz w:val="19"/>
           <w:szCs w:val="19"/>
         </w:rPr>
-        <w:t xml:space="preserve">7</w:t>
+        <w:t>7</w:t>
       </w:r>
       <w:r>
         <w:t xml:space="preserve"> / </w:t>
@@ -613,7 +674,7 @@
           <w:sz w:val="19"/>
           <w:szCs w:val="19"/>
         </w:rPr>
-        <w:t xml:space="preserve">5</w:t>
+        <w:t>5</w:t>
       </w:r>
       <w:r>
         <w:t xml:space="preserve"> / </w:t>
@@ -624,7 +685,7 @@
           <w:sz w:val="19"/>
           <w:szCs w:val="19"/>
         </w:rPr>
-        <w:t xml:space="preserve">error</w:t>
+        <w:t>error</w:t>
       </w:r>
       <w:r>
         <w:t xml:space="preserve"> 分别是文件的什么位置？</w:t>
@@ -632,34 +693,34 @@
     </w:p>
     <w:p>
       <w:r>
-        <w:t xml:space="preserve">2. 「警告（warning）」和「错误（error）」在这条命令下有区别吗？为什么？</w:t>
-      </w:r>
-    </w:p>
-    <w:p>
-      <w:r>
-        <w:t xml:space="preserve">3. 少写一个双引号时，gcc 报的行号还是你真正写错的那一行吗？</w:t>
-      </w:r>
-    </w:p>
-    <w:p>
-      <w:pPr>
-        <w:pStyle w:val="Quote"/>
-      </w:pPr>
-      <w:r>
-        <w:t xml:space="preserve">第一步跑不出来就贴报错给我。</w:t>
-      </w:r>
-    </w:p>
-    <w:p>
-      <w:pPr>
-        <w:pStyle w:val="Quote"/>
-      </w:pPr>
-      <w:r>
-        <w:t xml:space="preserve">第二步的报错</w:t>
+        <w:t>2. 「警告（warning）」和「错误（error）」在这条命令下有区别吗？为什么？</w:t>
+      </w:r>
+    </w:p>
+    <w:p>
+      <w:r>
+        <w:t>3. 少写一个双引号时，gcc 报的行号还是你真正写错的那一行吗？</w:t>
+      </w:r>
+    </w:p>
+    <w:p>
+      <w:pPr>
+        <w:pStyle w:val="7"/>
+      </w:pPr>
+      <w:r>
+        <w:t>第一步跑不出来就贴报错给我。</w:t>
+      </w:r>
+    </w:p>
+    <w:p>
+      <w:pPr>
+        <w:pStyle w:val="7"/>
+      </w:pPr>
+      <w:r>
+        <w:t>第二步的报错</w:t>
       </w:r>
       <w:r>
         <w:rPr>
           <w:b/>
         </w:rPr>
-        <w:t xml:space="preserve">别贴</w:t>
+        <w:t>别贴</w:t>
       </w:r>
       <w:r>
         <w:t xml:space="preserve"> —— 那是你今天要自己读的作业。</w:t>
@@ -667,18 +728,15 @@
     </w:p>
     <w:p>
       <w:pPr>
-        <w:pStyle w:val="HR"/>
-      </w:pPr>
-      <w:r>
-        <w:t xml:space="preserve"/>
-      </w:r>
-    </w:p>
-    <w:p>
-      <w:pPr>
-        <w:pStyle w:val="Heading2"/>
-      </w:pPr>
-      <w:r>
-        <w:t xml:space="preserve">2 · A02 · 类型到底占多少字节</w:t>
+        <w:pStyle w:val="11"/>
+      </w:pPr>
+    </w:p>
+    <w:p>
+      <w:pPr>
+        <w:pStyle w:val="3"/>
+      </w:pPr>
+      <w:r>
+        <w:t>2 · A02 · 类型到底占多少字节</w:t>
       </w:r>
     </w:p>
     <w:p>
@@ -686,7 +744,7 @@
         <w:rPr>
           <w:b/>
         </w:rPr>
-        <w:t xml:space="preserve">40 分钟 ｜ 文件：`A02.c`</w:t>
+        <w:t>40 分钟 ｜ 文件：`A02.c`</w:t>
       </w:r>
     </w:p>
     <w:p>
@@ -699,7 +757,7 @@
           <w:sz w:val="19"/>
           <w:szCs w:val="19"/>
         </w:rPr>
-        <w:t xml:space="preserve">sizeof</w:t>
+        <w:t>sizeof</w:t>
       </w:r>
       <w:r>
         <w:t xml:space="preserve"> 打印下面每一个的大小，</w:t>
@@ -708,23 +766,26 @@
         <w:rPr>
           <w:b/>
         </w:rPr>
-        <w:t xml:space="preserve">每个单独 printf 一行，并且标清楚是什么类型</w:t>
-      </w:r>
-      <w:r>
-        <w:t xml:space="preserve">：</w:t>
+        <w:t>每个单独 printf 一行，并且标清楚是什么类型</w:t>
+      </w:r>
+      <w:r>
+        <w:t>：</w:t>
       </w:r>
     </w:p>
     <w:tbl>
       <w:tblPr>
+        <w:tblStyle w:val="5"/>
         <w:tblW w:w="9000" w:type="dxa"/>
+        <w:tblInd w:w="0" w:type="dxa"/>
         <w:tblBorders>
-          <w:top w:val="single" w:sz="4" w:space="0" w:color="BFBFBF"/>
-          <w:left w:val="single" w:sz="4" w:space="0" w:color="BFBFBF"/>
-          <w:bottom w:val="single" w:sz="4" w:space="0" w:color="BFBFBF"/>
-          <w:right w:val="single" w:sz="4" w:space="0" w:color="BFBFBF"/>
-          <w:insideH w:val="single" w:sz="4" w:space="0" w:color="BFBFBF"/>
-          <w:insideV w:val="single" w:sz="4" w:space="0" w:color="BFBFBF"/>
+          <w:top w:val="single" w:color="BFBFBF" w:sz="4" w:space="0"/>
+          <w:left w:val="single" w:color="BFBFBF" w:sz="4" w:space="0"/>
+          <w:bottom w:val="single" w:color="BFBFBF" w:sz="4" w:space="0"/>
+          <w:right w:val="single" w:color="BFBFBF" w:sz="4" w:space="0"/>
+          <w:insideH w:val="single" w:color="BFBFBF" w:sz="4" w:space="0"/>
+          <w:insideV w:val="single" w:color="BFBFBF" w:sz="4" w:space="0"/>
         </w:tblBorders>
+        <w:tblLayout w:type="autofit"/>
         <w:tblCellMar>
           <w:top w:w="60" w:type="dxa"/>
           <w:left w:w="90" w:type="dxa"/>
@@ -737,6 +798,22 @@
         <w:gridCol w:w="4500"/>
       </w:tblGrid>
       <w:tr>
+        <w:tblPrEx>
+          <w:tblBorders>
+            <w:top w:val="single" w:color="BFBFBF" w:sz="4" w:space="0"/>
+            <w:left w:val="single" w:color="BFBFBF" w:sz="4" w:space="0"/>
+            <w:bottom w:val="single" w:color="BFBFBF" w:sz="4" w:space="0"/>
+            <w:right w:val="single" w:color="BFBFBF" w:sz="4" w:space="0"/>
+            <w:insideH w:val="single" w:color="BFBFBF" w:sz="4" w:space="0"/>
+            <w:insideV w:val="single" w:color="BFBFBF" w:sz="4" w:space="0"/>
+          </w:tblBorders>
+          <w:tblCellMar>
+            <w:top w:w="60" w:type="dxa"/>
+            <w:left w:w="90" w:type="dxa"/>
+            <w:bottom w:w="60" w:type="dxa"/>
+            <w:right w:w="90" w:type="dxa"/>
+          </w:tblCellMar>
+        </w:tblPrEx>
         <w:trPr>
           <w:tblHeader/>
         </w:trPr>
@@ -754,7 +831,7 @@
               <w:rPr>
                 <w:b/>
               </w:rPr>
-              <w:t xml:space="preserve">类别</w:t>
+              <w:t>类别</w:t>
             </w:r>
           </w:p>
         </w:tc>
@@ -772,12 +849,28 @@
               <w:rPr>
                 <w:b/>
               </w:rPr>
-              <w:t xml:space="preserve">类型</w:t>
+              <w:t>类型</w:t>
             </w:r>
           </w:p>
         </w:tc>
       </w:tr>
       <w:tr>
+        <w:tblPrEx>
+          <w:tblBorders>
+            <w:top w:val="single" w:color="BFBFBF" w:sz="4" w:space="0"/>
+            <w:left w:val="single" w:color="BFBFBF" w:sz="4" w:space="0"/>
+            <w:bottom w:val="single" w:color="BFBFBF" w:sz="4" w:space="0"/>
+            <w:right w:val="single" w:color="BFBFBF" w:sz="4" w:space="0"/>
+            <w:insideH w:val="single" w:color="BFBFBF" w:sz="4" w:space="0"/>
+            <w:insideV w:val="single" w:color="BFBFBF" w:sz="4" w:space="0"/>
+          </w:tblBorders>
+          <w:tblCellMar>
+            <w:top w:w="60" w:type="dxa"/>
+            <w:left w:w="90" w:type="dxa"/>
+            <w:bottom w:w="60" w:type="dxa"/>
+            <w:right w:w="90" w:type="dxa"/>
+          </w:tblCellMar>
+        </w:tblPrEx>
         <w:tc>
           <w:tcPr>
             <w:tcW w:w="4500" w:type="dxa"/>
@@ -788,7 +881,7 @@
               <w:spacing w:before="30" w:after="30" w:line="260" w:lineRule="auto"/>
             </w:pPr>
             <w:r>
-              <w:t xml:space="preserve">整型</w:t>
+              <w:t>整型</w:t>
             </w:r>
           </w:p>
         </w:tc>
@@ -807,7 +900,7 @@
                 <w:sz w:val="19"/>
                 <w:szCs w:val="19"/>
               </w:rPr>
-              <w:t xml:space="preserve">char</w:t>
+              <w:t>char</w:t>
             </w:r>
             <w:r>
               <w:t xml:space="preserve"> </w:t>
@@ -818,7 +911,7 @@
                 <w:sz w:val="19"/>
                 <w:szCs w:val="19"/>
               </w:rPr>
-              <w:t xml:space="preserve">short</w:t>
+              <w:t>short</w:t>
             </w:r>
             <w:r>
               <w:t xml:space="preserve"> </w:t>
@@ -829,7 +922,7 @@
                 <w:sz w:val="19"/>
                 <w:szCs w:val="19"/>
               </w:rPr>
-              <w:t xml:space="preserve">int</w:t>
+              <w:t>int</w:t>
             </w:r>
             <w:r>
               <w:t xml:space="preserve"> </w:t>
@@ -840,7 +933,7 @@
                 <w:sz w:val="19"/>
                 <w:szCs w:val="19"/>
               </w:rPr>
-              <w:t xml:space="preserve">long</w:t>
+              <w:t>long</w:t>
             </w:r>
             <w:r>
               <w:t xml:space="preserve"> </w:t>
@@ -851,12 +944,28 @@
                 <w:sz w:val="19"/>
                 <w:szCs w:val="19"/>
               </w:rPr>
-              <w:t xml:space="preserve">long long</w:t>
+              <w:t>long long</w:t>
             </w:r>
           </w:p>
         </w:tc>
       </w:tr>
       <w:tr>
+        <w:tblPrEx>
+          <w:tblBorders>
+            <w:top w:val="single" w:color="BFBFBF" w:sz="4" w:space="0"/>
+            <w:left w:val="single" w:color="BFBFBF" w:sz="4" w:space="0"/>
+            <w:bottom w:val="single" w:color="BFBFBF" w:sz="4" w:space="0"/>
+            <w:right w:val="single" w:color="BFBFBF" w:sz="4" w:space="0"/>
+            <w:insideH w:val="single" w:color="BFBFBF" w:sz="4" w:space="0"/>
+            <w:insideV w:val="single" w:color="BFBFBF" w:sz="4" w:space="0"/>
+          </w:tblBorders>
+          <w:tblCellMar>
+            <w:top w:w="60" w:type="dxa"/>
+            <w:left w:w="90" w:type="dxa"/>
+            <w:bottom w:w="60" w:type="dxa"/>
+            <w:right w:w="90" w:type="dxa"/>
+          </w:tblCellMar>
+        </w:tblPrEx>
         <w:tc>
           <w:tcPr>
             <w:tcW w:w="4500" w:type="dxa"/>
@@ -867,7 +976,7 @@
               <w:spacing w:before="30" w:after="30" w:line="260" w:lineRule="auto"/>
             </w:pPr>
             <w:r>
-              <w:t xml:space="preserve">浮点</w:t>
+              <w:t>浮点</w:t>
             </w:r>
           </w:p>
         </w:tc>
@@ -886,7 +995,7 @@
                 <w:sz w:val="19"/>
                 <w:szCs w:val="19"/>
               </w:rPr>
-              <w:t xml:space="preserve">float</w:t>
+              <w:t>float</w:t>
             </w:r>
             <w:r>
               <w:t xml:space="preserve"> </w:t>
@@ -897,12 +1006,28 @@
                 <w:sz w:val="19"/>
                 <w:szCs w:val="19"/>
               </w:rPr>
-              <w:t xml:space="preserve">double</w:t>
+              <w:t>double</w:t>
             </w:r>
           </w:p>
         </w:tc>
       </w:tr>
       <w:tr>
+        <w:tblPrEx>
+          <w:tblBorders>
+            <w:top w:val="single" w:color="BFBFBF" w:sz="4" w:space="0"/>
+            <w:left w:val="single" w:color="BFBFBF" w:sz="4" w:space="0"/>
+            <w:bottom w:val="single" w:color="BFBFBF" w:sz="4" w:space="0"/>
+            <w:right w:val="single" w:color="BFBFBF" w:sz="4" w:space="0"/>
+            <w:insideH w:val="single" w:color="BFBFBF" w:sz="4" w:space="0"/>
+            <w:insideV w:val="single" w:color="BFBFBF" w:sz="4" w:space="0"/>
+          </w:tblBorders>
+          <w:tblCellMar>
+            <w:top w:w="60" w:type="dxa"/>
+            <w:left w:w="90" w:type="dxa"/>
+            <w:bottom w:w="60" w:type="dxa"/>
+            <w:right w:w="90" w:type="dxa"/>
+          </w:tblCellMar>
+        </w:tblPrEx>
         <w:tc>
           <w:tcPr>
             <w:tcW w:w="4500" w:type="dxa"/>
@@ -913,7 +1038,7 @@
               <w:spacing w:before="30" w:after="30" w:line="260" w:lineRule="auto"/>
             </w:pPr>
             <w:r>
-              <w:t xml:space="preserve">其他</w:t>
+              <w:t>其他</w:t>
             </w:r>
           </w:p>
         </w:tc>
@@ -932,12 +1057,28 @@
                 <w:sz w:val="19"/>
                 <w:szCs w:val="19"/>
               </w:rPr>
-              <w:t xml:space="preserve">size_t</w:t>
+              <w:t>size_t</w:t>
             </w:r>
           </w:p>
         </w:tc>
       </w:tr>
       <w:tr>
+        <w:tblPrEx>
+          <w:tblBorders>
+            <w:top w:val="single" w:color="BFBFBF" w:sz="4" w:space="0"/>
+            <w:left w:val="single" w:color="BFBFBF" w:sz="4" w:space="0"/>
+            <w:bottom w:val="single" w:color="BFBFBF" w:sz="4" w:space="0"/>
+            <w:right w:val="single" w:color="BFBFBF" w:sz="4" w:space="0"/>
+            <w:insideH w:val="single" w:color="BFBFBF" w:sz="4" w:space="0"/>
+            <w:insideV w:val="single" w:color="BFBFBF" w:sz="4" w:space="0"/>
+          </w:tblBorders>
+          <w:tblCellMar>
+            <w:top w:w="60" w:type="dxa"/>
+            <w:left w:w="90" w:type="dxa"/>
+            <w:bottom w:w="60" w:type="dxa"/>
+            <w:right w:w="90" w:type="dxa"/>
+          </w:tblCellMar>
+        </w:tblPrEx>
         <w:tc>
           <w:tcPr>
             <w:tcW w:w="4500" w:type="dxa"/>
@@ -948,7 +1089,7 @@
               <w:spacing w:before="30" w:after="30" w:line="260" w:lineRule="auto"/>
             </w:pPr>
             <w:r>
-              <w:t xml:space="preserve">指针</w:t>
+              <w:t>指针</w:t>
             </w:r>
           </w:p>
         </w:tc>
@@ -967,7 +1108,7 @@
                 <w:sz w:val="19"/>
                 <w:szCs w:val="19"/>
               </w:rPr>
-              <w:t xml:space="preserve">int*</w:t>
+              <w:t>int*</w:t>
             </w:r>
             <w:r>
               <w:t xml:space="preserve"> </w:t>
@@ -978,7 +1119,7 @@
                 <w:sz w:val="19"/>
                 <w:szCs w:val="19"/>
               </w:rPr>
-              <w:t xml:space="preserve">char*</w:t>
+              <w:t>char*</w:t>
             </w:r>
             <w:r>
               <w:t xml:space="preserve"> </w:t>
@@ -989,7 +1130,7 @@
                 <w:sz w:val="19"/>
                 <w:szCs w:val="19"/>
               </w:rPr>
-              <w:t xml:space="preserve">double*</w:t>
+              <w:t>double*</w:t>
             </w:r>
             <w:r>
               <w:t xml:space="preserve"> </w:t>
@@ -1000,12 +1141,28 @@
                 <w:sz w:val="19"/>
                 <w:szCs w:val="19"/>
               </w:rPr>
-              <w:t xml:space="preserve">void*</w:t>
+              <w:t>void*</w:t>
             </w:r>
           </w:p>
         </w:tc>
       </w:tr>
       <w:tr>
+        <w:tblPrEx>
+          <w:tblBorders>
+            <w:top w:val="single" w:color="BFBFBF" w:sz="4" w:space="0"/>
+            <w:left w:val="single" w:color="BFBFBF" w:sz="4" w:space="0"/>
+            <w:bottom w:val="single" w:color="BFBFBF" w:sz="4" w:space="0"/>
+            <w:right w:val="single" w:color="BFBFBF" w:sz="4" w:space="0"/>
+            <w:insideH w:val="single" w:color="BFBFBF" w:sz="4" w:space="0"/>
+            <w:insideV w:val="single" w:color="BFBFBF" w:sz="4" w:space="0"/>
+          </w:tblBorders>
+          <w:tblCellMar>
+            <w:top w:w="60" w:type="dxa"/>
+            <w:left w:w="90" w:type="dxa"/>
+            <w:bottom w:w="60" w:type="dxa"/>
+            <w:right w:w="90" w:type="dxa"/>
+          </w:tblCellMar>
+        </w:tblPrEx>
         <w:tc>
           <w:tcPr>
             <w:tcW w:w="4500" w:type="dxa"/>
@@ -1016,7 +1173,7 @@
               <w:spacing w:before="30" w:after="30" w:line="260" w:lineRule="auto"/>
             </w:pPr>
             <w:r>
-              <w:t xml:space="preserve">结构体</w:t>
+              <w:t>结构体</w:t>
             </w:r>
           </w:p>
         </w:tc>
@@ -1038,7 +1195,7 @@
                 <w:sz w:val="19"/>
                 <w:szCs w:val="19"/>
               </w:rPr>
-              <w:t xml:space="preserve">struct { char a; int b; }</w:t>
+              <w:t>struct { char a; int b; }</w:t>
             </w:r>
             <w:r>
               <w:t xml:space="preserve"> 再打印它</w:t>
@@ -1049,10 +1206,10 @@
     </w:tbl>
     <w:p>
       <w:pPr>
-        <w:pStyle w:val="Heading3"/>
-      </w:pPr>
-      <w:r>
-        <w:t xml:space="preserve">做完要在心里能回答</w:t>
+        <w:pStyle w:val="4"/>
+      </w:pPr>
+      <w:r>
+        <w:t>做完要在心里能回答</w:t>
       </w:r>
     </w:p>
     <w:p>
@@ -1065,7 +1222,7 @@
           <w:sz w:val="19"/>
           <w:szCs w:val="19"/>
         </w:rPr>
-        <w:t xml:space="preserve">int</w:t>
+        <w:t>int</w:t>
       </w:r>
       <w:r>
         <w:t xml:space="preserve"> 是几字节？</w:t>
@@ -1076,7 +1233,7 @@
           <w:sz w:val="19"/>
           <w:szCs w:val="19"/>
         </w:rPr>
-        <w:t xml:space="preserve">long</w:t>
+        <w:t>long</w:t>
       </w:r>
       <w:r>
         <w:t xml:space="preserve"> 和 </w:t>
@@ -1087,7 +1244,7 @@
           <w:sz w:val="19"/>
           <w:szCs w:val="19"/>
         </w:rPr>
-        <w:t xml:space="preserve">long long</w:t>
+        <w:t>long long</w:t>
       </w:r>
       <w:r>
         <w:t xml:space="preserve"> 一样大吗？</w:t>
@@ -1103,40 +1260,40 @@
           <w:sz w:val="19"/>
           <w:szCs w:val="19"/>
         </w:rPr>
-        <w:t xml:space="preserve">int*</w:t>
-      </w:r>
-      <w:r>
-        <w:t xml:space="preserve">、</w:t>
-      </w:r>
-      <w:r>
-        <w:rPr>
-          <w:rFonts w:ascii="Consolas" w:hAnsi="Consolas"/>
-          <w:sz w:val="19"/>
-          <w:szCs w:val="19"/>
-        </w:rPr>
-        <w:t xml:space="preserve">char*</w:t>
-      </w:r>
-      <w:r>
-        <w:t xml:space="preserve">、</w:t>
-      </w:r>
-      <w:r>
-        <w:rPr>
-          <w:rFonts w:ascii="Consolas" w:hAnsi="Consolas"/>
-          <w:sz w:val="19"/>
-          <w:szCs w:val="19"/>
-        </w:rPr>
-        <w:t xml:space="preserve">double*</w:t>
-      </w:r>
-      <w:r>
-        <w:t xml:space="preserve">、</w:t>
-      </w:r>
-      <w:r>
-        <w:rPr>
-          <w:rFonts w:ascii="Consolas" w:hAnsi="Consolas"/>
-          <w:sz w:val="19"/>
-          <w:szCs w:val="19"/>
-        </w:rPr>
-        <w:t xml:space="preserve">void*</w:t>
+        <w:t>int*</w:t>
+      </w:r>
+      <w:r>
+        <w:t>、</w:t>
+      </w:r>
+      <w:r>
+        <w:rPr>
+          <w:rFonts w:ascii="Consolas" w:hAnsi="Consolas"/>
+          <w:sz w:val="19"/>
+          <w:szCs w:val="19"/>
+        </w:rPr>
+        <w:t>char*</w:t>
+      </w:r>
+      <w:r>
+        <w:t>、</w:t>
+      </w:r>
+      <w:r>
+        <w:rPr>
+          <w:rFonts w:ascii="Consolas" w:hAnsi="Consolas"/>
+          <w:sz w:val="19"/>
+          <w:szCs w:val="19"/>
+        </w:rPr>
+        <w:t>double*</w:t>
+      </w:r>
+      <w:r>
+        <w:t>、</w:t>
+      </w:r>
+      <w:r>
+        <w:rPr>
+          <w:rFonts w:ascii="Consolas" w:hAnsi="Consolas"/>
+          <w:sz w:val="19"/>
+          <w:szCs w:val="19"/>
+        </w:rPr>
+        <w:t>void*</w:t>
       </w:r>
       <w:r>
         <w:t xml:space="preserve"> 的 </w:t>
@@ -1147,7 +1304,7 @@
           <w:sz w:val="19"/>
           <w:szCs w:val="19"/>
         </w:rPr>
-        <w:t xml:space="preserve">sizeof</w:t>
+        <w:t>sizeof</w:t>
       </w:r>
       <w:r>
         <w:t xml:space="preserve"> </w:t>
@@ -1156,10 +1313,10 @@
         <w:rPr>
           <w:b/>
         </w:rPr>
-        <w:t xml:space="preserve">全都一样</w:t>
-      </w:r>
-      <w:r>
-        <w:t xml:space="preserve">？它们指向的东西大小差那么远，凭什么一样？</w:t>
+        <w:t>全都一样</w:t>
+      </w:r>
+      <w:r>
+        <w:t>？它们指向的东西大小差那么远，凭什么一样？</w:t>
       </w:r>
     </w:p>
     <w:p>
@@ -1172,7 +1329,7 @@
           <w:sz w:val="19"/>
           <w:szCs w:val="19"/>
         </w:rPr>
-        <w:t xml:space="preserve">struct { char a; int b; }</w:t>
+        <w:t>struct { char a; int b; }</w:t>
       </w:r>
       <w:r>
         <w:t xml:space="preserve"> 打印出来是几？如果答案是 5，那说明你对；如果不是 5，那么——为什么会多出来？</w:t>
@@ -1180,43 +1337,40 @@
     </w:p>
     <w:p>
       <w:pPr>
-        <w:pStyle w:val="Quote"/>
-      </w:pPr>
-      <w:r>
-        <w:t xml:space="preserve">第 3 问是</w:t>
+        <w:pStyle w:val="7"/>
+      </w:pPr>
+      <w:r>
+        <w:t>第 3 问是</w:t>
       </w:r>
       <w:r>
         <w:rPr>
           <w:b/>
         </w:rPr>
-        <w:t xml:space="preserve">内存对齐（memory alignment）</w:t>
-      </w:r>
-      <w:r>
-        <w:t xml:space="preserve">的入口。这一问允许你现在答不出来，</w:t>
-      </w:r>
-    </w:p>
-    <w:p>
-      <w:pPr>
-        <w:pStyle w:val="Quote"/>
-      </w:pPr>
-      <w:r>
-        <w:t xml:space="preserve">但必须把实际数字抄进今天的记录里。第三题禁止背答案 —— 必须是这台机器上真跑出来的数字。</w:t>
-      </w:r>
-    </w:p>
-    <w:p>
-      <w:pPr>
-        <w:pStyle w:val="HR"/>
-      </w:pPr>
-      <w:r>
-        <w:t xml:space="preserve"/>
-      </w:r>
-    </w:p>
-    <w:p>
-      <w:pPr>
-        <w:pStyle w:val="Heading2"/>
-      </w:pPr>
-      <w:r>
-        <w:t xml:space="preserve">3 · A03 · 同一个数的五种面孔</w:t>
+        <w:t>内存对齐（memory alignment）</w:t>
+      </w:r>
+      <w:r>
+        <w:t>的入口。这一问允许你现在答不出来，</w:t>
+      </w:r>
+    </w:p>
+    <w:p>
+      <w:pPr>
+        <w:pStyle w:val="7"/>
+      </w:pPr>
+      <w:r>
+        <w:t>但必须把实际数字抄进今天的记录里。第三题禁止背答案 —— 必须是这台机器上真跑出来的数字。</w:t>
+      </w:r>
+    </w:p>
+    <w:p>
+      <w:pPr>
+        <w:pStyle w:val="11"/>
+      </w:pPr>
+    </w:p>
+    <w:p>
+      <w:pPr>
+        <w:pStyle w:val="3"/>
+      </w:pPr>
+      <w:r>
+        <w:t>3 · A03 · 同一个数的五种面孔</w:t>
       </w:r>
     </w:p>
     <w:p>
@@ -1224,7 +1378,7 @@
         <w:rPr>
           <w:b/>
         </w:rPr>
-        <w:t xml:space="preserve">30 分钟 ｜ 文件：`A03.c`（做不完留到周四）</w:t>
+        <w:t>30 分钟 ｜ 文件：`A03.c`（做不完留到周四）</w:t>
       </w:r>
     </w:p>
     <w:p>
@@ -1237,18 +1391,18 @@
           <w:sz w:val="19"/>
           <w:szCs w:val="19"/>
         </w:rPr>
-        <w:t xml:space="preserve">int n = 65;</w:t>
-      </w:r>
-      <w:r>
-        <w:t xml:space="preserve">，用这五个格式符各输出一次：</w:t>
-      </w:r>
-      <w:r>
-        <w:rPr>
-          <w:rFonts w:ascii="Consolas" w:hAnsi="Consolas"/>
-          <w:sz w:val="19"/>
-          <w:szCs w:val="19"/>
-        </w:rPr>
-        <w:t xml:space="preserve">%d</w:t>
+        <w:t>int n = 65;</w:t>
+      </w:r>
+      <w:r>
+        <w:t>，用这五个格式符各输出一次：</w:t>
+      </w:r>
+      <w:r>
+        <w:rPr>
+          <w:rFonts w:ascii="Consolas" w:hAnsi="Consolas"/>
+          <w:sz w:val="19"/>
+          <w:szCs w:val="19"/>
+        </w:rPr>
+        <w:t>%d</w:t>
       </w:r>
       <w:r>
         <w:t xml:space="preserve"> </w:t>
@@ -1259,7 +1413,7 @@
           <w:sz w:val="19"/>
           <w:szCs w:val="19"/>
         </w:rPr>
-        <w:t xml:space="preserve">%u</w:t>
+        <w:t>%u</w:t>
       </w:r>
       <w:r>
         <w:t xml:space="preserve"> </w:t>
@@ -1270,7 +1424,7 @@
           <w:sz w:val="19"/>
           <w:szCs w:val="19"/>
         </w:rPr>
-        <w:t xml:space="preserve">%x</w:t>
+        <w:t>%x</w:t>
       </w:r>
       <w:r>
         <w:t xml:space="preserve"> </w:t>
@@ -1281,7 +1435,7 @@
           <w:sz w:val="19"/>
           <w:szCs w:val="19"/>
         </w:rPr>
-        <w:t xml:space="preserve">%o</w:t>
+        <w:t>%o</w:t>
       </w:r>
       <w:r>
         <w:t xml:space="preserve"> </w:t>
@@ -1292,10 +1446,10 @@
           <w:sz w:val="19"/>
           <w:szCs w:val="19"/>
         </w:rPr>
-        <w:t xml:space="preserve">%c</w:t>
-      </w:r>
-      <w:r>
-        <w:t xml:space="preserve">。</w:t>
+        <w:t>%c</w:t>
+      </w:r>
+      <w:r>
+        <w:t>。</w:t>
       </w:r>
     </w:p>
     <w:p>
@@ -1308,7 +1462,7 @@
           <w:sz w:val="19"/>
           <w:szCs w:val="19"/>
         </w:rPr>
-        <w:t xml:space="preserve">n</w:t>
+        <w:t>n</w:t>
       </w:r>
       <w:r>
         <w:t xml:space="preserve"> 改成 </w:t>
@@ -1319,27 +1473,27 @@
           <w:sz w:val="19"/>
           <w:szCs w:val="19"/>
         </w:rPr>
-        <w:t xml:space="preserve">-1</w:t>
-      </w:r>
-      <w:r>
-        <w:t xml:space="preserve">，</w:t>
+        <w:t>-1</w:t>
+      </w:r>
+      <w:r>
+        <w:t>，</w:t>
       </w:r>
       <w:r>
         <w:rPr>
           <w:b/>
         </w:rPr>
-        <w:t xml:space="preserve">同样的五个格式符再跑一遍</w:t>
-      </w:r>
-      <w:r>
-        <w:t xml:space="preserve">。</w:t>
-      </w:r>
-    </w:p>
-    <w:p>
-      <w:pPr>
-        <w:pStyle w:val="Heading3"/>
-      </w:pPr>
-      <w:r>
-        <w:t xml:space="preserve">做完要在心里能回答</w:t>
+        <w:t>同样的五个格式符再跑一遍</w:t>
+      </w:r>
+      <w:r>
+        <w:t>。</w:t>
+      </w:r>
+    </w:p>
+    <w:p>
+      <w:pPr>
+        <w:pStyle w:val="4"/>
+      </w:pPr>
+      <w:r>
+        <w:t>做完要在心里能回答</w:t>
       </w:r>
     </w:p>
     <w:p>
@@ -1352,7 +1506,7 @@
           <w:sz w:val="19"/>
           <w:szCs w:val="19"/>
         </w:rPr>
-        <w:t xml:space="preserve">65</w:t>
+        <w:t>65</w:t>
       </w:r>
       <w:r>
         <w:t xml:space="preserve"> 用 </w:t>
@@ -1363,7 +1517,7 @@
           <w:sz w:val="19"/>
           <w:szCs w:val="19"/>
         </w:rPr>
-        <w:t xml:space="preserve">%c</w:t>
+        <w:t>%c</w:t>
       </w:r>
       <w:r>
         <w:t xml:space="preserve"> 打出来是什么字符？</w:t>
@@ -1374,7 +1528,7 @@
           <w:sz w:val="19"/>
           <w:szCs w:val="19"/>
         </w:rPr>
-        <w:t xml:space="preserve">-1</w:t>
+        <w:t>-1</w:t>
       </w:r>
       <w:r>
         <w:t xml:space="preserve"> 用 </w:t>
@@ -1385,7 +1539,7 @@
           <w:sz w:val="19"/>
           <w:szCs w:val="19"/>
         </w:rPr>
-        <w:t xml:space="preserve">%c</w:t>
+        <w:t>%c</w:t>
       </w:r>
       <w:r>
         <w:t xml:space="preserve"> 又是什么？</w:t>
@@ -1401,7 +1555,7 @@
           <w:sz w:val="19"/>
           <w:szCs w:val="19"/>
         </w:rPr>
-        <w:t xml:space="preserve">-1</w:t>
+        <w:t>-1</w:t>
       </w:r>
       <w:r>
         <w:t xml:space="preserve"> 用 </w:t>
@@ -1412,7 +1566,7 @@
           <w:sz w:val="19"/>
           <w:szCs w:val="19"/>
         </w:rPr>
-        <w:t xml:space="preserve">%u</w:t>
+        <w:t>%u</w:t>
       </w:r>
       <w:r>
         <w:t xml:space="preserve"> 打出来是一个很大的正整数。</w:t>
@@ -1421,7 +1575,7 @@
         <w:rPr>
           <w:b/>
         </w:rPr>
-        <w:t xml:space="preserve">为什么是这个数？</w:t>
+        <w:t>为什么是这个数？</w:t>
       </w:r>
     </w:p>
     <w:p>
@@ -1434,7 +1588,7 @@
           <w:sz w:val="19"/>
           <w:szCs w:val="19"/>
         </w:rPr>
-        <w:t xml:space="preserve">%u</w:t>
+        <w:t>%u</w:t>
       </w:r>
       <w:r>
         <w:t xml:space="preserve"> 要求对应的实参是什么类型，再对照你传进去的类型。</w:t>
@@ -1450,7 +1604,7 @@
           <w:sz w:val="19"/>
           <w:szCs w:val="19"/>
         </w:rPr>
-        <w:t xml:space="preserve">-1</w:t>
+        <w:t>-1</w:t>
       </w:r>
       <w:r>
         <w:t xml:space="preserve"> 用 </w:t>
@@ -1461,7 +1615,7 @@
           <w:sz w:val="19"/>
           <w:szCs w:val="19"/>
         </w:rPr>
-        <w:t xml:space="preserve">%x</w:t>
+        <w:t>%x</w:t>
       </w:r>
       <w:r>
         <w:t xml:space="preserve"> 打出来是几个 </w:t>
@@ -1472,69 +1626,66 @@
           <w:sz w:val="19"/>
           <w:szCs w:val="19"/>
         </w:rPr>
-        <w:t xml:space="preserve">f</w:t>
-      </w:r>
-      <w:r>
-        <w:t xml:space="preserve">？为什么是这个个数？</w:t>
-      </w:r>
-    </w:p>
-    <w:p>
-      <w:pPr>
-        <w:pStyle w:val="Quote"/>
-      </w:pPr>
-      <w:r>
-        <w:t xml:space="preserve">第 2、3 问是你第一次撞上</w:t>
+        <w:t>f</w:t>
+      </w:r>
+      <w:r>
+        <w:t>？为什么是这个个数？</w:t>
+      </w:r>
+    </w:p>
+    <w:p>
+      <w:pPr>
+        <w:pStyle w:val="7"/>
+      </w:pPr>
+      <w:r>
+        <w:t>第 2、3 问是你第一次撞上</w:t>
       </w:r>
       <w:r>
         <w:rPr>
           <w:b/>
         </w:rPr>
-        <w:t xml:space="preserve">补码（two's complement）</w:t>
-      </w:r>
-      <w:r>
-        <w:t xml:space="preserve">和</w:t>
+        <w:t>补码（two's complement）</w:t>
+      </w:r>
+      <w:r>
+        <w:t>和</w:t>
       </w:r>
       <w:r>
         <w:rPr>
           <w:b/>
         </w:rPr>
-        <w:t xml:space="preserve">默认实参提升（default argument promotion）</w:t>
-      </w:r>
-      <w:r>
-        <w:t xml:space="preserve">。</w:t>
-      </w:r>
-    </w:p>
-    <w:p>
-      <w:pPr>
-        <w:pStyle w:val="Quote"/>
-      </w:pPr>
-      <w:r>
-        <w:t xml:space="preserve">现在答不出来是正常的 —— 把</w:t>
+        <w:t>默认实参提升（default argument promotion）</w:t>
+      </w:r>
+      <w:r>
+        <w:t>。</w:t>
+      </w:r>
+    </w:p>
+    <w:p>
+      <w:pPr>
+        <w:pStyle w:val="7"/>
+      </w:pPr>
+      <w:r>
+        <w:t>现在答不出来是正常的 —— 把</w:t>
       </w:r>
       <w:r>
         <w:rPr>
           <w:b/>
         </w:rPr>
-        <w:t xml:space="preserve">现象</w:t>
-      </w:r>
-      <w:r>
-        <w:t xml:space="preserve">抄下来就行，别急着找解释。</w:t>
-      </w:r>
-    </w:p>
-    <w:p>
-      <w:pPr>
-        <w:pStyle w:val="HR"/>
-      </w:pPr>
-      <w:r>
-        <w:t xml:space="preserve"/>
-      </w:r>
-    </w:p>
-    <w:p>
-      <w:pPr>
-        <w:pStyle w:val="Heading2"/>
-      </w:pPr>
-      <w:r>
-        <w:t xml:space="preserve">4 · 收尾（10 分钟）</w:t>
+        <w:t>现象</w:t>
+      </w:r>
+      <w:r>
+        <w:t>抄下来就行，别急着找解释。</w:t>
+      </w:r>
+    </w:p>
+    <w:p>
+      <w:pPr>
+        <w:pStyle w:val="11"/>
+      </w:pPr>
+    </w:p>
+    <w:p>
+      <w:pPr>
+        <w:pStyle w:val="3"/>
+      </w:pPr>
+      <w:r>
+        <w:t>4 · 收尾（10 分钟）</w:t>
       </w:r>
     </w:p>
     <w:p>
@@ -1547,58 +1698,72 @@
           <w:sz w:val="19"/>
           <w:szCs w:val="19"/>
         </w:rPr>
-        <w:t xml:space="preserve">present/journal/2026-10.md</w:t>
-      </w:r>
-      <w:r>
-        <w:t xml:space="preserve">：</w:t>
-      </w:r>
-    </w:p>
-    <w:p>
-      <w:pPr>
-        <w:pStyle w:val="Code"/>
-      </w:pPr>
-      <w:r>
-        <w:t xml:space="preserve">## 2026-10-13</w:t>
-        <w:br/>
-        <w:t xml:space="preserve"/>
-        <w:br/>
-        <w:t xml:space="preserve">- 做了：A01 / A02 / A03（没做的划掉）</w:t>
-        <w:br/>
-        <w:t xml:space="preserve">- 卡在：（哪个概念 —— 写不出来就写「说不清楚」）</w:t>
-        <w:br/>
-        <w:t xml:space="preserve">- 现象：（报错原文，或者反直觉的输出）</w:t>
-        <w:br/>
-        <w:t xml:space="preserve">- 下一步要验证：（一个具体的问题）</w:t>
-      </w:r>
-    </w:p>
-    <w:p>
-      <w:pPr>
-        <w:pStyle w:val="HR"/>
-      </w:pPr>
-      <w:r>
-        <w:t xml:space="preserve"/>
-      </w:r>
-    </w:p>
-    <w:p>
-      <w:pPr>
-        <w:pStyle w:val="Heading2"/>
-      </w:pPr>
-      <w:r>
-        <w:t xml:space="preserve">今日验收 —— 不是「做完了」，是这三条</w:t>
-      </w:r>
-    </w:p>
-    <w:p>
-      <w:pPr>
-        <w:pStyle w:val="Check"/>
-      </w:pPr>
-      <w:r>
-        <w:t xml:space="preserve">☐  能</w:t>
+        <w:t>present/journal/2026-10.md</w:t>
+      </w:r>
+      <w:r>
+        <w:t>：</w:t>
+      </w:r>
+    </w:p>
+    <w:p>
+      <w:pPr>
+        <w:pStyle w:val="8"/>
+      </w:pPr>
+      <w:r>
+        <w:t>## 2026-10-13</w:t>
+      </w:r>
+      <w:r>
+        <w:br w:type="textWrapping"/>
+      </w:r>
+      <w:r>
+        <w:br w:type="textWrapping"/>
+      </w:r>
+      <w:r>
+        <w:t>- 做了：A01 / A02 / A03（没做的划掉）</w:t>
+      </w:r>
+      <w:r>
+        <w:br w:type="textWrapping"/>
+      </w:r>
+      <w:r>
+        <w:t>- 卡在：（哪个概念 —— 写不出来就写「说不清楚」）</w:t>
+      </w:r>
+      <w:r>
+        <w:br w:type="textWrapping"/>
+      </w:r>
+      <w:r>
+        <w:t>- 现象：（报错原文，或者反直觉的输出）</w:t>
+      </w:r>
+      <w:r>
+        <w:br w:type="textWrapping"/>
+      </w:r>
+      <w:r>
+        <w:t>- 下一步要验证：（一个具体的问题）</w:t>
+      </w:r>
+    </w:p>
+    <w:p>
+      <w:pPr>
+        <w:pStyle w:val="11"/>
+      </w:pPr>
+    </w:p>
+    <w:p>
+      <w:pPr>
+        <w:pStyle w:val="3"/>
+      </w:pPr>
+      <w:r>
+        <w:t>今日验收 —— 不是「做完了」，是这三条</w:t>
+      </w:r>
+    </w:p>
+    <w:p>
+      <w:pPr>
+        <w:pStyle w:val="9"/>
+      </w:pPr>
+      <w:r>
+        <w:t>☐  能</w:t>
       </w:r>
       <w:r>
         <w:rPr>
           <w:b/>
         </w:rPr>
-        <w:t xml:space="preserve">逐段念出</w:t>
+        <w:t>逐段念出</w:t>
       </w:r>
       <w:r>
         <w:t xml:space="preserve"> </w:t>
@@ -1609,7 +1774,7 @@
           <w:sz w:val="19"/>
           <w:szCs w:val="19"/>
         </w:rPr>
-        <w:t xml:space="preserve">A01.c:7:5: error: ...</w:t>
+        <w:t>A01.c:7:5: error: ...</w:t>
       </w:r>
       <w:r>
         <w:t xml:space="preserve"> 里每一部分是什么意思</w:t>
@@ -1617,7 +1782,7 @@
     </w:p>
     <w:p>
       <w:pPr>
-        <w:pStyle w:val="Check"/>
+        <w:pStyle w:val="9"/>
       </w:pPr>
       <w:r>
         <w:t xml:space="preserve">☐  能说出你机器上 </w:t>
@@ -1628,7 +1793,7 @@
           <w:sz w:val="19"/>
           <w:szCs w:val="19"/>
         </w:rPr>
-        <w:t xml:space="preserve">int</w:t>
+        <w:t>int</w:t>
       </w:r>
       <w:r>
         <w:t xml:space="preserve"> 是几字节、以及</w:t>
@@ -1637,12 +1802,19 @@
         <w:rPr>
           <w:b/>
         </w:rPr>
-        <w:t xml:space="preserve">为什么所有指针的 `sizeof` 相同</w:t>
-      </w:r>
-    </w:p>
-    <w:p>
-      <w:pPr>
-        <w:pStyle w:val="Check"/>
+        <w:t>为什么所有指针的 `si</w:t>
+      </w:r>
+      <w:bookmarkStart w:id="0" w:name="_GoBack"/>
+      <w:r>
+        <w:rPr>
+          <w:b/>
+        </w:rPr>
+        <w:t>zeof` 相同</w:t>
+      </w:r>
+    </w:p>
+    <w:p>
+      <w:pPr>
+        <w:pStyle w:val="9"/>
       </w:pPr>
       <w:r>
         <w:t xml:space="preserve">☐  </w:t>
@@ -1653,7 +1825,7 @@
           <w:sz w:val="19"/>
           <w:szCs w:val="19"/>
         </w:rPr>
-        <w:t xml:space="preserve">present/code/c/</w:t>
+        <w:t>present/code/c/</w:t>
       </w:r>
       <w:r>
         <w:t xml:space="preserve"> 下多出 3 个 </w:t>
@@ -1664,7 +1836,7 @@
           <w:sz w:val="19"/>
           <w:szCs w:val="19"/>
         </w:rPr>
-        <w:t xml:space="preserve">.c</w:t>
+        <w:t>.c</w:t>
       </w:r>
       <w:r>
         <w:t xml:space="preserve"> 文件，</w:t>
@@ -1675,29 +1847,33 @@
           <w:sz w:val="19"/>
           <w:szCs w:val="19"/>
         </w:rPr>
-        <w:t xml:space="preserve">build/</w:t>
-      </w:r>
-      <w:r>
-        <w:t xml:space="preserve"> 下多出 3 个可执行文件</w:t>
-      </w:r>
-    </w:p>
-    <w:p>
-      <w:pPr>
-        <w:pStyle w:val="Quote"/>
-      </w:pPr>
-      <w:r>
-        <w:t xml:space="preserve">三条里做到两条就算过。</w:t>
-      </w:r>
-    </w:p>
-    <w:p>
-      <w:pPr>
-        <w:pStyle w:val="Quote"/>
+        <w:t>build/</w:t>
+      </w:r>
+      <w:r>
+        <w:t xml:space="preserve"> 下</w:t>
+      </w:r>
+      <w:bookmarkEnd w:id="0"/>
+      <w:r>
+        <w:t>多出 3 个可执行文件</w:t>
+      </w:r>
+    </w:p>
+    <w:p>
+      <w:pPr>
+        <w:pStyle w:val="7"/>
+      </w:pPr>
+      <w:r>
+        <w:t>三条里做到两条就算过。</w:t>
+      </w:r>
+    </w:p>
+    <w:p>
+      <w:pPr>
+        <w:pStyle w:val="7"/>
       </w:pPr>
       <w:r>
         <w:rPr>
           <w:b/>
         </w:rPr>
-        <w:t xml:space="preserve">一条都没做到，也要把卡住的那句报错原文贴给我</w:t>
+        <w:t>一条都没做到，也要把卡住的那句报错原文贴给我</w:t>
       </w:r>
       <w:r>
         <w:t xml:space="preserve"> —— 贴了才算今天在推进。</w:t>
@@ -1705,71 +1881,394 @@
     </w:p>
     <w:p>
       <w:pPr>
-        <w:pStyle w:val="HR"/>
-      </w:pPr>
-      <w:r>
-        <w:t xml:space="preserve"/>
-      </w:r>
-    </w:p>
-    <w:p>
-      <w:pPr>
-        <w:pStyle w:val="Heading2"/>
-      </w:pPr>
-      <w:r>
-        <w:t xml:space="preserve">交付格式（发到对话里）</w:t>
-      </w:r>
-    </w:p>
-    <w:p>
-      <w:pPr>
-        <w:pStyle w:val="Code"/>
-      </w:pPr>
-      <w:r>
-        <w:t xml:space="preserve">【今天】2026-10-13</w:t>
-        <w:br/>
-        <w:t xml:space="preserve">【状态】A01 完成 / A02 完成 / A03 未做</w:t>
-        <w:br/>
-        <w:t xml:space="preserve">【文件】A01.c  A02.c  A03.c        ← 三个都贴完整代码</w:t>
-        <w:br/>
-        <w:t xml:space="preserve">【A02 输出】                        ← 贴数字，不要贴描述</w:t>
-        <w:br/>
-        <w:t xml:space="preserve">【调试记录】                        ← A01 第二步的报错原文 + 你的判断</w:t>
-        <w:br/>
-        <w:t xml:space="preserve">【卡住的】                          ← 一句话</w:t>
+        <w:pStyle w:val="11"/>
+      </w:pPr>
+    </w:p>
+    <w:p>
+      <w:pPr>
+        <w:pStyle w:val="3"/>
+      </w:pPr>
+      <w:r>
+        <w:t>交付格式（发到对话里）</w:t>
+      </w:r>
+    </w:p>
+    <w:p>
+      <w:pPr>
+        <w:pStyle w:val="8"/>
+      </w:pPr>
+      <w:r>
+        <w:t>【今天】2026-10-13</w:t>
+      </w:r>
+      <w:r>
+        <w:br w:type="textWrapping"/>
+      </w:r>
+      <w:r>
+        <w:t>【状态】A01 完成 / A02 完成 / A03 未做</w:t>
+      </w:r>
+      <w:r>
+        <w:br w:type="textWrapping"/>
+      </w:r>
+      <w:r>
+        <w:t>【文件】A01.c  A02.c  A03.c        ← 三个都贴完整代码</w:t>
+      </w:r>
+      <w:r>
+        <w:br w:type="textWrapping"/>
+      </w:r>
+      <w:r>
+        <w:t>【A02 输出】                        ← 贴数字，不要贴描述</w:t>
+      </w:r>
+      <w:r>
+        <w:br w:type="textWrapping"/>
+      </w:r>
+      <w:r>
+        <w:t>【调试记录】                        ← A01 第二步的报错原文 + 你的判断</w:t>
+      </w:r>
+      <w:r>
+        <w:br w:type="textWrapping"/>
+      </w:r>
+      <w:r>
+        <w:t>【卡住的】                          ← 一句话</w:t>
       </w:r>
     </w:p>
     <w:p/>
     <w:sectPr>
       <w:pgSz w:w="11906" w:h="16838"/>
       <w:pgMar w:top="1134" w:right="1134" w:bottom="1134" w:left="1134" w:header="851" w:footer="992" w:gutter="0"/>
+      <w:cols w:space="720" w:num="1"/>
     </w:sectPr>
   </w:body>
 </w:document>
 </file>
 
+<file path=word/endnotes.xml><?xml version="1.0" encoding="utf-8"?>
+<w:endnotes xmlns:wpc="http://schemas.microsoft.com/office/word/2010/wordprocessingCanvas" xmlns:mc="http://schemas.openxmlformats.org/markup-compatibility/2006" xmlns:o="urn:schemas-microsoft-com:office:office" xmlns:r="http://schemas.openxmlformats.org/officeDocument/2006/relationships" xmlns:m="http://schemas.openxmlformats.org/officeDocument/2006/math" xmlns:v="urn:schemas-microsoft-com:vml" xmlns:wp14="http://schemas.microsoft.com/office/word/2010/wordprocessingDrawing" xmlns:wp="http://schemas.openxmlformats.org/drawingml/2006/wordprocessingDrawing" xmlns:w="http://schemas.openxmlformats.org/wordprocessingml/2006/main" xmlns:w14="http://schemas.microsoft.com/office/word/2010/wordml" xmlns:w15="http://schemas.microsoft.com/office/word/2012/wordml" xmlns:w10="urn:schemas-microsoft-com:office:word" xmlns:wpg="http://schemas.microsoft.com/office/word/2010/wordprocessingGroup" xmlns:wpi="http://schemas.microsoft.com/office/word/2010/wordprocessingInk" xmlns:wne="http://schemas.microsoft.com/office/word/2006/wordml" xmlns:wps="http://schemas.microsoft.com/office/word/2010/wordprocessingShape" xmlns:wpsCustomData="http://www.wps.cn/officeDocument/2013/wpsCustomData" mc:Ignorable="w14 w15 wp14">
+  <w:endnote w:type="separator" w:id="0">
+    <w:p>
+      <w:pPr>
+        <w:spacing w:line="240" w:lineRule="auto"/>
+      </w:pPr>
+      <w:r>
+        <w:separator/>
+      </w:r>
+    </w:p>
+  </w:endnote>
+  <w:endnote w:type="continuationSeparator" w:id="1">
+    <w:p>
+      <w:pPr>
+        <w:spacing w:line="240" w:lineRule="auto"/>
+      </w:pPr>
+      <w:r>
+        <w:continuationSeparator/>
+      </w:r>
+    </w:p>
+  </w:endnote>
+</w:endnotes>
+</file>
+
+<file path=word/footnotes.xml><?xml version="1.0" encoding="utf-8"?>
+<w:footnotes xmlns:wpc="http://schemas.microsoft.com/office/word/2010/wordprocessingCanvas" xmlns:mc="http://schemas.openxmlformats.org/markup-compatibility/2006" xmlns:o="urn:schemas-microsoft-com:office:office" xmlns:r="http://schemas.openxmlformats.org/officeDocument/2006/relationships" xmlns:m="http://schemas.openxmlformats.org/officeDocument/2006/math" xmlns:v="urn:schemas-microsoft-com:vml" xmlns:wp14="http://schemas.microsoft.com/office/word/2010/wordprocessingDrawing" xmlns:wp="http://schemas.openxmlformats.org/drawingml/2006/wordprocessingDrawing" xmlns:w="http://schemas.openxmlformats.org/wordprocessingml/2006/main" xmlns:w14="http://schemas.microsoft.com/office/word/2010/wordml" xmlns:w15="http://schemas.microsoft.com/office/word/2012/wordml" xmlns:w10="urn:schemas-microsoft-com:office:word" xmlns:wpg="http://schemas.microsoft.com/office/word/2010/wordprocessingGroup" xmlns:wpi="http://schemas.microsoft.com/office/word/2010/wordprocessingInk" xmlns:wne="http://schemas.microsoft.com/office/word/2006/wordml" xmlns:wps="http://schemas.microsoft.com/office/word/2010/wordprocessingShape" xmlns:wpsCustomData="http://www.wps.cn/officeDocument/2013/wpsCustomData" mc:Ignorable="w14 w15 wp14">
+  <w:footnote w:type="separator" w:id="0">
+    <w:p>
+      <w:pPr>
+        <w:spacing w:before="0" w:after="0" w:line="300" w:lineRule="auto"/>
+      </w:pPr>
+      <w:r>
+        <w:separator/>
+      </w:r>
+    </w:p>
+  </w:footnote>
+  <w:footnote w:type="continuationSeparator" w:id="1">
+    <w:p>
+      <w:pPr>
+        <w:spacing w:before="0" w:after="0" w:line="300" w:lineRule="auto"/>
+      </w:pPr>
+      <w:r>
+        <w:continuationSeparator/>
+      </w:r>
+    </w:p>
+  </w:footnote>
+</w:footnotes>
+</file>
+
 <file path=word/styles.xml><?xml version="1.0" encoding="utf-8"?>
-<w:styles xmlns:w="http://schemas.openxmlformats.org/wordprocessingml/2006/main">
+<w:styles xmlns:mc="http://schemas.openxmlformats.org/markup-compatibility/2006" xmlns:o="urn:schemas-microsoft-com:office:office" xmlns:r="http://schemas.openxmlformats.org/officeDocument/2006/relationships" xmlns:m="http://schemas.openxmlformats.org/officeDocument/2006/math" xmlns:v="urn:schemas-microsoft-com:vml" xmlns:w="http://schemas.openxmlformats.org/wordprocessingml/2006/main" xmlns:w14="http://schemas.microsoft.com/office/word/2010/wordml" xmlns:w10="urn:schemas-microsoft-com:office:word" xmlns:sl="http://schemas.openxmlformats.org/schemaLibrary/2006/main" xmlns:wpsCustomData="http://www.wps.cn/officeDocument/2013/wpsCustomData" mc:Ignorable="w14">
   <w:docDefaults>
     <w:rPrDefault>
       <w:rPr>
         <w:rFonts w:ascii="Calibri" w:hAnsi="Calibri" w:eastAsia="微软雅黑" w:cs="Calibri"/>
-        <w:sz w:val="21"/>
-        <w:szCs w:val="21"/>
       </w:rPr>
     </w:rPrDefault>
-    <w:pPrDefault>
-      <w:pPr>
-        <w:spacing w:before="0" w:after="120" w:line="300" w:lineRule="auto"/>
-      </w:pPr>
-    </w:pPrDefault>
+    <w:pPrDefault/>
   </w:docDefaults>
-  <w:style w:type="paragraph" w:default="1" w:styleId="Normal">
+  <w:latentStyles w:count="260" w:defQFormat="0" w:defUnhideWhenUsed="1" w:defSemiHidden="1" w:defUIPriority="99" w:defLockedState="0">
+    <w:lsdException w:qFormat="1" w:unhideWhenUsed="0" w:uiPriority="0" w:semiHidden="0" w:name="Normal"/>
+    <w:lsdException w:qFormat="1" w:unhideWhenUsed="0" w:uiPriority="0" w:semiHidden="0" w:name="heading 1"/>
+    <w:lsdException w:qFormat="1" w:unhideWhenUsed="0" w:uiPriority="0" w:semiHidden="0" w:name="heading 2"/>
+    <w:lsdException w:qFormat="1" w:unhideWhenUsed="0" w:uiPriority="0" w:semiHidden="0" w:name="heading 3"/>
+    <w:lsdException w:qFormat="1" w:uiPriority="0" w:name="heading 4"/>
+    <w:lsdException w:qFormat="1" w:uiPriority="0" w:name="heading 5"/>
+    <w:lsdException w:qFormat="1" w:uiPriority="0" w:name="heading 6"/>
+    <w:lsdException w:qFormat="1" w:uiPriority="0" w:name="heading 7"/>
+    <w:lsdException w:qFormat="1" w:uiPriority="0" w:name="heading 8"/>
+    <w:lsdException w:qFormat="1" w:uiPriority="0" w:name="heading 9"/>
+    <w:lsdException w:unhideWhenUsed="0" w:uiPriority="0" w:semiHidden="0" w:name="index 1"/>
+    <w:lsdException w:unhideWhenUsed="0" w:uiPriority="0" w:semiHidden="0" w:name="index 2"/>
+    <w:lsdException w:unhideWhenUsed="0" w:uiPriority="0" w:semiHidden="0" w:name="index 3"/>
+    <w:lsdException w:unhideWhenUsed="0" w:uiPriority="0" w:semiHidden="0" w:name="index 4"/>
+    <w:lsdException w:unhideWhenUsed="0" w:uiPriority="0" w:semiHidden="0" w:name="index 5"/>
+    <w:lsdException w:unhideWhenUsed="0" w:uiPriority="0" w:semiHidden="0" w:name="index 6"/>
+    <w:lsdException w:unhideWhenUsed="0" w:uiPriority="0" w:semiHidden="0" w:name="index 7"/>
+    <w:lsdException w:unhideWhenUsed="0" w:uiPriority="0" w:semiHidden="0" w:name="index 8"/>
+    <w:lsdException w:unhideWhenUsed="0" w:uiPriority="0" w:semiHidden="0" w:name="index 9"/>
+    <w:lsdException w:unhideWhenUsed="0" w:uiPriority="0" w:semiHidden="0" w:name="toc 1"/>
+    <w:lsdException w:unhideWhenUsed="0" w:uiPriority="0" w:semiHidden="0" w:name="toc 2"/>
+    <w:lsdException w:unhideWhenUsed="0" w:uiPriority="0" w:semiHidden="0" w:name="toc 3"/>
+    <w:lsdException w:unhideWhenUsed="0" w:uiPriority="0" w:semiHidden="0" w:name="toc 4"/>
+    <w:lsdException w:unhideWhenUsed="0" w:uiPriority="0" w:semiHidden="0" w:name="toc 5"/>
+    <w:lsdException w:unhideWhenUsed="0" w:uiPriority="0" w:semiHidden="0" w:name="toc 6"/>
+    <w:lsdException w:unhideWhenUsed="0" w:uiPriority="0" w:semiHidden="0" w:name="toc 7"/>
+    <w:lsdException w:unhideWhenUsed="0" w:uiPriority="0" w:semiHidden="0" w:name="toc 8"/>
+    <w:lsdException w:unhideWhenUsed="0" w:uiPriority="0" w:semiHidden="0" w:name="toc 9"/>
+    <w:lsdException w:unhideWhenUsed="0" w:uiPriority="0" w:semiHidden="0" w:name="Normal Indent"/>
+    <w:lsdException w:unhideWhenUsed="0" w:uiPriority="0" w:semiHidden="0" w:name="footnote text"/>
+    <w:lsdException w:unhideWhenUsed="0" w:uiPriority="0" w:semiHidden="0" w:name="annotation text"/>
+    <w:lsdException w:unhideWhenUsed="0" w:uiPriority="0" w:semiHidden="0" w:name="header"/>
+    <w:lsdException w:unhideWhenUsed="0" w:uiPriority="0" w:semiHidden="0" w:name="footer"/>
+    <w:lsdException w:unhideWhenUsed="0" w:uiPriority="0" w:semiHidden="0" w:name="index heading"/>
+    <w:lsdException w:qFormat="1" w:uiPriority="0" w:name="caption"/>
+    <w:lsdException w:unhideWhenUsed="0" w:uiPriority="0" w:semiHidden="0" w:name="table of figures"/>
+    <w:lsdException w:unhideWhenUsed="0" w:uiPriority="0" w:semiHidden="0" w:name="envelope address"/>
+    <w:lsdException w:unhideWhenUsed="0" w:uiPriority="0" w:semiHidden="0" w:name="envelope return"/>
+    <w:lsdException w:unhideWhenUsed="0" w:uiPriority="0" w:semiHidden="0" w:name="footnote reference"/>
+    <w:lsdException w:unhideWhenUsed="0" w:uiPriority="0" w:semiHidden="0" w:name="annotation reference"/>
+    <w:lsdException w:unhideWhenUsed="0" w:uiPriority="0" w:semiHidden="0" w:name="line number"/>
+    <w:lsdException w:unhideWhenUsed="0" w:uiPriority="0" w:semiHidden="0" w:name="page number"/>
+    <w:lsdException w:unhideWhenUsed="0" w:uiPriority="0" w:semiHidden="0" w:name="endnote reference"/>
+    <w:lsdException w:unhideWhenUsed="0" w:uiPriority="0" w:semiHidden="0" w:name="endnote text"/>
+    <w:lsdException w:unhideWhenUsed="0" w:uiPriority="0" w:semiHidden="0" w:name="table of authorities"/>
+    <w:lsdException w:unhideWhenUsed="0" w:uiPriority="0" w:semiHidden="0" w:name="macro"/>
+    <w:lsdException w:unhideWhenUsed="0" w:uiPriority="0" w:semiHidden="0" w:name="toa heading"/>
+    <w:lsdException w:unhideWhenUsed="0" w:uiPriority="0" w:semiHidden="0" w:name="List"/>
+    <w:lsdException w:unhideWhenUsed="0" w:uiPriority="0" w:semiHidden="0" w:name="List Bullet"/>
+    <w:lsdException w:unhideWhenUsed="0" w:uiPriority="0" w:semiHidden="0" w:name="List Number"/>
+    <w:lsdException w:unhideWhenUsed="0" w:uiPriority="0" w:semiHidden="0" w:name="List 2"/>
+    <w:lsdException w:unhideWhenUsed="0" w:uiPriority="0" w:semiHidden="0" w:name="List 3"/>
+    <w:lsdException w:unhideWhenUsed="0" w:uiPriority="0" w:semiHidden="0" w:name="List 4"/>
+    <w:lsdException w:unhideWhenUsed="0" w:uiPriority="0" w:semiHidden="0" w:name="List 5"/>
+    <w:lsdException w:unhideWhenUsed="0" w:uiPriority="0" w:semiHidden="0" w:name="List Bullet 2"/>
+    <w:lsdException w:unhideWhenUsed="0" w:uiPriority="0" w:semiHidden="0" w:name="List Bullet 3"/>
+    <w:lsdException w:unhideWhenUsed="0" w:uiPriority="0" w:semiHidden="0" w:name="List Bullet 4"/>
+    <w:lsdException w:unhideWhenUsed="0" w:uiPriority="0" w:semiHidden="0" w:name="List Bullet 5"/>
+    <w:lsdException w:unhideWhenUsed="0" w:uiPriority="0" w:semiHidden="0" w:name="List Number 2"/>
+    <w:lsdException w:unhideWhenUsed="0" w:uiPriority="0" w:semiHidden="0" w:name="List Number 3"/>
+    <w:lsdException w:unhideWhenUsed="0" w:uiPriority="0" w:semiHidden="0" w:name="List Number 4"/>
+    <w:lsdException w:unhideWhenUsed="0" w:uiPriority="0" w:semiHidden="0" w:name="List Number 5"/>
+    <w:lsdException w:qFormat="1" w:unhideWhenUsed="0" w:uiPriority="0" w:semiHidden="0" w:name="Title"/>
+    <w:lsdException w:unhideWhenUsed="0" w:uiPriority="0" w:semiHidden="0" w:name="Closing"/>
+    <w:lsdException w:unhideWhenUsed="0" w:uiPriority="0" w:semiHidden="0" w:name="Signature"/>
+    <w:lsdException w:unhideWhenUsed="0" w:uiPriority="0" w:name="Default Paragraph Font"/>
+    <w:lsdException w:unhideWhenUsed="0" w:uiPriority="0" w:semiHidden="0" w:name="Body Text"/>
+    <w:lsdException w:unhideWhenUsed="0" w:uiPriority="0" w:semiHidden="0" w:name="Body Text Indent"/>
+    <w:lsdException w:unhideWhenUsed="0" w:uiPriority="0" w:semiHidden="0" w:name="List Continue"/>
+    <w:lsdException w:unhideWhenUsed="0" w:uiPriority="0" w:semiHidden="0" w:name="List Continue 2"/>
+    <w:lsdException w:unhideWhenUsed="0" w:uiPriority="0" w:semiHidden="0" w:name="List Continue 3"/>
+    <w:lsdException w:unhideWhenUsed="0" w:uiPriority="0" w:semiHidden="0" w:name="List Continue 4"/>
+    <w:lsdException w:unhideWhenUsed="0" w:uiPriority="0" w:semiHidden="0" w:name="List Continue 5"/>
+    <w:lsdException w:unhideWhenUsed="0" w:uiPriority="0" w:semiHidden="0" w:name="Message Header"/>
+    <w:lsdException w:qFormat="1" w:unhideWhenUsed="0" w:uiPriority="0" w:semiHidden="0" w:name="Subtitle"/>
+    <w:lsdException w:unhideWhenUsed="0" w:uiPriority="0" w:semiHidden="0" w:name="Salutation"/>
+    <w:lsdException w:unhideWhenUsed="0" w:uiPriority="0" w:semiHidden="0" w:name="Date"/>
+    <w:lsdException w:unhideWhenUsed="0" w:uiPriority="0" w:semiHidden="0" w:name="Body Text First Indent"/>
+    <w:lsdException w:unhideWhenUsed="0" w:uiPriority="0" w:semiHidden="0" w:name="Body Text First Indent 2"/>
+    <w:lsdException w:unhideWhenUsed="0" w:uiPriority="0" w:semiHidden="0" w:name="Note Heading"/>
+    <w:lsdException w:unhideWhenUsed="0" w:uiPriority="0" w:semiHidden="0" w:name="Body Text 2"/>
+    <w:lsdException w:unhideWhenUsed="0" w:uiPriority="0" w:semiHidden="0" w:name="Body Text 3"/>
+    <w:lsdException w:unhideWhenUsed="0" w:uiPriority="0" w:semiHidden="0" w:name="Body Text Indent 2"/>
+    <w:lsdException w:unhideWhenUsed="0" w:uiPriority="0" w:semiHidden="0" w:name="Body Text Indent 3"/>
+    <w:lsdException w:unhideWhenUsed="0" w:uiPriority="0" w:semiHidden="0" w:name="Block Text"/>
+    <w:lsdException w:unhideWhenUsed="0" w:uiPriority="0" w:semiHidden="0" w:name="Hyperlink"/>
+    <w:lsdException w:unhideWhenUsed="0" w:uiPriority="0" w:semiHidden="0" w:name="FollowedHyperlink"/>
+    <w:lsdException w:qFormat="1" w:unhideWhenUsed="0" w:uiPriority="0" w:semiHidden="0" w:name="Strong"/>
+    <w:lsdException w:qFormat="1" w:unhideWhenUsed="0" w:uiPriority="0" w:semiHidden="0" w:name="Emphasis"/>
+    <w:lsdException w:unhideWhenUsed="0" w:uiPriority="0" w:semiHidden="0" w:name="Document Map"/>
+    <w:lsdException w:unhideWhenUsed="0" w:uiPriority="0" w:semiHidden="0" w:name="Plain Text"/>
+    <w:lsdException w:unhideWhenUsed="0" w:uiPriority="0" w:semiHidden="0" w:name="E-mail Signature"/>
+    <w:lsdException w:unhideWhenUsed="0" w:uiPriority="0" w:semiHidden="0" w:name="Normal (Web)"/>
+    <w:lsdException w:unhideWhenUsed="0" w:uiPriority="0" w:semiHidden="0" w:name="HTML Acronym"/>
+    <w:lsdException w:unhideWhenUsed="0" w:uiPriority="0" w:semiHidden="0" w:name="HTML Address"/>
+    <w:lsdException w:unhideWhenUsed="0" w:uiPriority="0" w:semiHidden="0" w:name="HTML Cite"/>
+    <w:lsdException w:unhideWhenUsed="0" w:uiPriority="0" w:semiHidden="0" w:name="HTML Code"/>
+    <w:lsdException w:unhideWhenUsed="0" w:uiPriority="0" w:semiHidden="0" w:name="HTML Definition"/>
+    <w:lsdException w:unhideWhenUsed="0" w:uiPriority="0" w:semiHidden="0" w:name="HTML Keyboard"/>
+    <w:lsdException w:unhideWhenUsed="0" w:uiPriority="0" w:semiHidden="0" w:name="HTML Preformatted"/>
+    <w:lsdException w:unhideWhenUsed="0" w:uiPriority="0" w:semiHidden="0" w:name="HTML Sample"/>
+    <w:lsdException w:unhideWhenUsed="0" w:uiPriority="0" w:semiHidden="0" w:name="HTML Typewriter"/>
+    <w:lsdException w:unhideWhenUsed="0" w:uiPriority="0" w:semiHidden="0" w:name="HTML Variable"/>
+    <w:lsdException w:qFormat="1" w:unhideWhenUsed="0" w:uiPriority="0" w:name="Normal Table"/>
+    <w:lsdException w:unhideWhenUsed="0" w:uiPriority="0" w:semiHidden="0" w:name="annotation subject"/>
+    <w:lsdException w:unhideWhenUsed="0" w:uiPriority="0" w:semiHidden="0" w:name="Table Simple 1"/>
+    <w:lsdException w:unhideWhenUsed="0" w:uiPriority="0" w:semiHidden="0" w:name="Table Simple 2"/>
+    <w:lsdException w:unhideWhenUsed="0" w:uiPriority="0" w:semiHidden="0" w:name="Table Simple 3"/>
+    <w:lsdException w:unhideWhenUsed="0" w:uiPriority="0" w:semiHidden="0" w:name="Table Classic 1"/>
+    <w:lsdException w:unhideWhenUsed="0" w:uiPriority="0" w:semiHidden="0" w:name="Table Classic 2"/>
+    <w:lsdException w:unhideWhenUsed="0" w:uiPriority="0" w:semiHidden="0" w:name="Table Classic 3"/>
+    <w:lsdException w:unhideWhenUsed="0" w:uiPriority="0" w:semiHidden="0" w:name="Table Classic 4"/>
+    <w:lsdException w:unhideWhenUsed="0" w:uiPriority="0" w:semiHidden="0" w:name="Table Colorful 1"/>
+    <w:lsdException w:unhideWhenUsed="0" w:uiPriority="0" w:semiHidden="0" w:name="Table Colorful 2"/>
+    <w:lsdException w:unhideWhenUsed="0" w:uiPriority="0" w:semiHidden="0" w:name="Table Colorful 3"/>
+    <w:lsdException w:unhideWhenUsed="0" w:uiPriority="0" w:semiHidden="0" w:name="Table Columns 1"/>
+    <w:lsdException w:unhideWhenUsed="0" w:uiPriority="0" w:semiHidden="0" w:name="Table Columns 2"/>
+    <w:lsdException w:unhideWhenUsed="0" w:uiPriority="0" w:semiHidden="0" w:name="Table Columns 3"/>
+    <w:lsdException w:unhideWhenUsed="0" w:uiPriority="0" w:semiHidden="0" w:name="Table Columns 4"/>
+    <w:lsdException w:unhideWhenUsed="0" w:uiPriority="0" w:semiHidden="0" w:name="Table Columns 5"/>
+    <w:lsdException w:unhideWhenUsed="0" w:uiPriority="0" w:semiHidden="0" w:name="Table Grid 1"/>
+    <w:lsdException w:unhideWhenUsed="0" w:uiPriority="0" w:semiHidden="0" w:name="Table Grid 2"/>
+    <w:lsdException w:unhideWhenUsed="0" w:uiPriority="0" w:semiHidden="0" w:name="Table Grid 3"/>
+    <w:lsdException w:unhideWhenUsed="0" w:uiPriority="0" w:semiHidden="0" w:name="Table Grid 4"/>
+    <w:lsdException w:unhideWhenUsed="0" w:uiPriority="0" w:semiHidden="0" w:name="Table Grid 5"/>
+    <w:lsdException w:unhideWhenUsed="0" w:uiPriority="0" w:semiHidden="0" w:name="Table Grid 6"/>
+    <w:lsdException w:unhideWhenUsed="0" w:uiPriority="0" w:semiHidden="0" w:name="Table Grid 7"/>
+    <w:lsdException w:unhideWhenUsed="0" w:uiPriority="0" w:semiHidden="0" w:name="Table Grid 8"/>
+    <w:lsdException w:unhideWhenUsed="0" w:uiPriority="0" w:semiHidden="0" w:name="Table List 1"/>
+    <w:lsdException w:unhideWhenUsed="0" w:uiPriority="0" w:semiHidden="0" w:name="Table List 2"/>
+    <w:lsdException w:unhideWhenUsed="0" w:uiPriority="0" w:semiHidden="0" w:name="Table List 3"/>
+    <w:lsdException w:unhideWhenUsed="0" w:uiPriority="0" w:semiHidden="0" w:name="Table List 4"/>
+    <w:lsdException w:unhideWhenUsed="0" w:uiPriority="0" w:semiHidden="0" w:name="Table List 5"/>
+    <w:lsdException w:unhideWhenUsed="0" w:uiPriority="0" w:semiHidden="0" w:name="Table List 6"/>
+    <w:lsdException w:unhideWhenUsed="0" w:uiPriority="0" w:semiHidden="0" w:name="Table List 7"/>
+    <w:lsdException w:unhideWhenUsed="0" w:uiPriority="0" w:semiHidden="0" w:name="Table List 8"/>
+    <w:lsdException w:unhideWhenUsed="0" w:uiPriority="0" w:semiHidden="0" w:name="Table 3D effects 1"/>
+    <w:lsdException w:unhideWhenUsed="0" w:uiPriority="0" w:semiHidden="0" w:name="Table 3D effects 2"/>
+    <w:lsdException w:unhideWhenUsed="0" w:uiPriority="0" w:semiHidden="0" w:name="Table 3D effects 3"/>
+    <w:lsdException w:unhideWhenUsed="0" w:uiPriority="0" w:semiHidden="0" w:name="Table Contemporary"/>
+    <w:lsdException w:unhideWhenUsed="0" w:uiPriority="0" w:semiHidden="0" w:name="Table Elegant"/>
+    <w:lsdException w:unhideWhenUsed="0" w:uiPriority="0" w:semiHidden="0" w:name="Table Professional"/>
+    <w:lsdException w:unhideWhenUsed="0" w:uiPriority="0" w:semiHidden="0" w:name="Table Subtle 1"/>
+    <w:lsdException w:unhideWhenUsed="0" w:uiPriority="0" w:semiHidden="0" w:name="Table Subtle 2"/>
+    <w:lsdException w:unhideWhenUsed="0" w:uiPriority="0" w:semiHidden="0" w:name="Table Web 1"/>
+    <w:lsdException w:unhideWhenUsed="0" w:uiPriority="0" w:semiHidden="0" w:name="Table Web 2"/>
+    <w:lsdException w:unhideWhenUsed="0" w:uiPriority="0" w:semiHidden="0" w:name="Table Web 3"/>
+    <w:lsdException w:unhideWhenUsed="0" w:uiPriority="0" w:semiHidden="0" w:name="Balloon Text"/>
+    <w:lsdException w:unhideWhenUsed="0" w:uiPriority="0" w:semiHidden="0" w:name="Table Grid"/>
+    <w:lsdException w:unhideWhenUsed="0" w:uiPriority="0" w:semiHidden="0" w:name="Table Theme"/>
+    <w:lsdException w:unhideWhenUsed="0" w:uiPriority="60" w:semiHidden="0" w:name="Light Shading"/>
+    <w:lsdException w:unhideWhenUsed="0" w:uiPriority="61" w:semiHidden="0" w:name="Light List"/>
+    <w:lsdException w:unhideWhenUsed="0" w:uiPriority="62" w:semiHidden="0" w:name="Light Grid"/>
+    <w:lsdException w:unhideWhenUsed="0" w:uiPriority="63" w:semiHidden="0" w:name="Medium Shading 1"/>
+    <w:lsdException w:unhideWhenUsed="0" w:uiPriority="64" w:semiHidden="0" w:name="Medium Shading 2"/>
+    <w:lsdException w:unhideWhenUsed="0" w:uiPriority="65" w:semiHidden="0" w:name="Medium List 1"/>
+    <w:lsdException w:unhideWhenUsed="0" w:uiPriority="66" w:semiHidden="0" w:name="Medium List 2"/>
+    <w:lsdException w:unhideWhenUsed="0" w:uiPriority="67" w:semiHidden="0" w:name="Medium Grid 1"/>
+    <w:lsdException w:unhideWhenUsed="0" w:uiPriority="68" w:semiHidden="0" w:name="Medium Grid 2"/>
+    <w:lsdException w:unhideWhenUsed="0" w:uiPriority="69" w:semiHidden="0" w:name="Medium Grid 3"/>
+    <w:lsdException w:unhideWhenUsed="0" w:uiPriority="70" w:semiHidden="0" w:name="Dark List"/>
+    <w:lsdException w:unhideWhenUsed="0" w:uiPriority="71" w:semiHidden="0" w:name="Colorful Shading"/>
+    <w:lsdException w:unhideWhenUsed="0" w:uiPriority="72" w:semiHidden="0" w:name="Colorful List"/>
+    <w:lsdException w:unhideWhenUsed="0" w:uiPriority="73" w:semiHidden="0" w:name="Colorful Grid"/>
+    <w:lsdException w:unhideWhenUsed="0" w:uiPriority="60" w:semiHidden="0" w:name="Light Shading Accent 1"/>
+    <w:lsdException w:unhideWhenUsed="0" w:uiPriority="61" w:semiHidden="0" w:name="Light List Accent 1"/>
+    <w:lsdException w:unhideWhenUsed="0" w:uiPriority="62" w:semiHidden="0" w:name="Light Grid Accent 1"/>
+    <w:lsdException w:unhideWhenUsed="0" w:uiPriority="63" w:semiHidden="0" w:name="Medium Shading 1 Accent 1"/>
+    <w:lsdException w:unhideWhenUsed="0" w:uiPriority="64" w:semiHidden="0" w:name="Medium Shading 2 Accent 1"/>
+    <w:lsdException w:unhideWhenUsed="0" w:uiPriority="65" w:semiHidden="0" w:name="Medium List 1 Accent 1"/>
+    <w:lsdException w:unhideWhenUsed="0" w:uiPriority="0" w:semiHidden="0" w:name="Quote"/>
+    <w:lsdException w:unhideWhenUsed="0" w:uiPriority="66" w:semiHidden="0" w:name="Medium List 2 Accent 1"/>
+    <w:lsdException w:unhideWhenUsed="0" w:uiPriority="67" w:semiHidden="0" w:name="Medium Grid 1 Accent 1"/>
+    <w:lsdException w:unhideWhenUsed="0" w:uiPriority="68" w:semiHidden="0" w:name="Medium Grid 2 Accent 1"/>
+    <w:lsdException w:unhideWhenUsed="0" w:uiPriority="69" w:semiHidden="0" w:name="Medium Grid 3 Accent 1"/>
+    <w:lsdException w:unhideWhenUsed="0" w:uiPriority="70" w:semiHidden="0" w:name="Dark List Accent 1"/>
+    <w:lsdException w:unhideWhenUsed="0" w:uiPriority="71" w:semiHidden="0" w:name="Colorful Shading Accent 1"/>
+    <w:lsdException w:unhideWhenUsed="0" w:uiPriority="72" w:semiHidden="0" w:name="Colorful List Accent 1"/>
+    <w:lsdException w:unhideWhenUsed="0" w:uiPriority="73" w:semiHidden="0" w:name="Colorful Grid Accent 1"/>
+    <w:lsdException w:unhideWhenUsed="0" w:uiPriority="60" w:semiHidden="0" w:name="Light Shading Accent 2"/>
+    <w:lsdException w:unhideWhenUsed="0" w:uiPriority="61" w:semiHidden="0" w:name="Light List Accent 2"/>
+    <w:lsdException w:unhideWhenUsed="0" w:uiPriority="62" w:semiHidden="0" w:name="Light Grid Accent 2"/>
+    <w:lsdException w:unhideWhenUsed="0" w:uiPriority="63" w:semiHidden="0" w:name="Medium Shading 1 Accent 2"/>
+    <w:lsdException w:unhideWhenUsed="0" w:uiPriority="64" w:semiHidden="0" w:name="Medium Shading 2 Accent 2"/>
+    <w:lsdException w:unhideWhenUsed="0" w:uiPriority="65" w:semiHidden="0" w:name="Medium List 1 Accent 2"/>
+    <w:lsdException w:unhideWhenUsed="0" w:uiPriority="66" w:semiHidden="0" w:name="Medium List 2 Accent 2"/>
+    <w:lsdException w:unhideWhenUsed="0" w:uiPriority="67" w:semiHidden="0" w:name="Medium Grid 1 Accent 2"/>
+    <w:lsdException w:unhideWhenUsed="0" w:uiPriority="68" w:semiHidden="0" w:name="Medium Grid 2 Accent 2"/>
+    <w:lsdException w:unhideWhenUsed="0" w:uiPriority="69" w:semiHidden="0" w:name="Medium Grid 3 Accent 2"/>
+    <w:lsdException w:unhideWhenUsed="0" w:uiPriority="70" w:semiHidden="0" w:name="Dark List Accent 2"/>
+    <w:lsdException w:unhideWhenUsed="0" w:uiPriority="71" w:semiHidden="0" w:name="Colorful Shading Accent 2"/>
+    <w:lsdException w:unhideWhenUsed="0" w:uiPriority="72" w:semiHidden="0" w:name="Colorful List Accent 2"/>
+    <w:lsdException w:unhideWhenUsed="0" w:uiPriority="73" w:semiHidden="0" w:name="Colorful Grid Accent 2"/>
+    <w:lsdException w:unhideWhenUsed="0" w:uiPriority="60" w:semiHidden="0" w:name="Light Shading Accent 3"/>
+    <w:lsdException w:unhideWhenUsed="0" w:uiPriority="61" w:semiHidden="0" w:name="Light List Accent 3"/>
+    <w:lsdException w:unhideWhenUsed="0" w:uiPriority="62" w:semiHidden="0" w:name="Light Grid Accent 3"/>
+    <w:lsdException w:unhideWhenUsed="0" w:uiPriority="63" w:semiHidden="0" w:name="Medium Shading 1 Accent 3"/>
+    <w:lsdException w:unhideWhenUsed="0" w:uiPriority="64" w:semiHidden="0" w:name="Medium Shading 2 Accent 3"/>
+    <w:lsdException w:unhideWhenUsed="0" w:uiPriority="65" w:semiHidden="0" w:name="Medium List 1 Accent 3"/>
+    <w:lsdException w:unhideWhenUsed="0" w:uiPriority="66" w:semiHidden="0" w:name="Medium List 2 Accent 3"/>
+    <w:lsdException w:unhideWhenUsed="0" w:uiPriority="67" w:semiHidden="0" w:name="Medium Grid 1 Accent 3"/>
+    <w:lsdException w:unhideWhenUsed="0" w:uiPriority="68" w:semiHidden="0" w:name="Medium Grid 2 Accent 3"/>
+    <w:lsdException w:unhideWhenUsed="0" w:uiPriority="69" w:semiHidden="0" w:name="Medium Grid 3 Accent 3"/>
+    <w:lsdException w:unhideWhenUsed="0" w:uiPriority="70" w:semiHidden="0" w:name="Dark List Accent 3"/>
+    <w:lsdException w:unhideWhenUsed="0" w:uiPriority="71" w:semiHidden="0" w:name="Colorful Shading Accent 3"/>
+    <w:lsdException w:unhideWhenUsed="0" w:uiPriority="72" w:semiHidden="0" w:name="Colorful List Accent 3"/>
+    <w:lsdException w:unhideWhenUsed="0" w:uiPriority="73" w:semiHidden="0" w:name="Colorful Grid Accent 3"/>
+    <w:lsdException w:unhideWhenUsed="0" w:uiPriority="60" w:semiHidden="0" w:name="Light Shading Accent 4"/>
+    <w:lsdException w:unhideWhenUsed="0" w:uiPriority="61" w:semiHidden="0" w:name="Light List Accent 4"/>
+    <w:lsdException w:unhideWhenUsed="0" w:uiPriority="62" w:semiHidden="0" w:name="Light Grid Accent 4"/>
+    <w:lsdException w:unhideWhenUsed="0" w:uiPriority="63" w:semiHidden="0" w:name="Medium Shading 1 Accent 4"/>
+    <w:lsdException w:unhideWhenUsed="0" w:uiPriority="64" w:semiHidden="0" w:name="Medium Shading 2 Accent 4"/>
+    <w:lsdException w:unhideWhenUsed="0" w:uiPriority="65" w:semiHidden="0" w:name="Medium List 1 Accent 4"/>
+    <w:lsdException w:unhideWhenUsed="0" w:uiPriority="66" w:semiHidden="0" w:name="Medium List 2 Accent 4"/>
+    <w:lsdException w:unhideWhenUsed="0" w:uiPriority="67" w:semiHidden="0" w:name="Medium Grid 1 Accent 4"/>
+    <w:lsdException w:unhideWhenUsed="0" w:uiPriority="68" w:semiHidden="0" w:name="Medium Grid 2 Accent 4"/>
+    <w:lsdException w:unhideWhenUsed="0" w:uiPriority="69" w:semiHidden="0" w:name="Medium Grid 3 Accent 4"/>
+    <w:lsdException w:unhideWhenUsed="0" w:uiPriority="70" w:semiHidden="0" w:name="Dark List Accent 4"/>
+    <w:lsdException w:unhideWhenUsed="0" w:uiPriority="71" w:semiHidden="0" w:name="Colorful Shading Accent 4"/>
+    <w:lsdException w:unhideWhenUsed="0" w:uiPriority="72" w:semiHidden="0" w:name="Colorful List Accent 4"/>
+    <w:lsdException w:unhideWhenUsed="0" w:uiPriority="73" w:semiHidden="0" w:name="Colorful Grid Accent 4"/>
+    <w:lsdException w:unhideWhenUsed="0" w:uiPriority="60" w:semiHidden="0" w:name="Light Shading Accent 5"/>
+    <w:lsdException w:unhideWhenUsed="0" w:uiPriority="61" w:semiHidden="0" w:name="Light List Accent 5"/>
+    <w:lsdException w:unhideWhenUsed="0" w:uiPriority="62" w:semiHidden="0" w:name="Light Grid Accent 5"/>
+    <w:lsdException w:unhideWhenUsed="0" w:uiPriority="63" w:semiHidden="0" w:name="Medium Shading 1 Accent 5"/>
+    <w:lsdException w:unhideWhenUsed="0" w:uiPriority="64" w:semiHidden="0" w:name="Medium Shading 2 Accent 5"/>
+    <w:lsdException w:unhideWhenUsed="0" w:uiPriority="65" w:semiHidden="0" w:name="Medium List 1 Accent 5"/>
+    <w:lsdException w:unhideWhenUsed="0" w:uiPriority="66" w:semiHidden="0" w:name="Medium List 2 Accent 5"/>
+    <w:lsdException w:unhideWhenUsed="0" w:uiPriority="67" w:semiHidden="0" w:name="Medium Grid 1 Accent 5"/>
+    <w:lsdException w:unhideWhenUsed="0" w:uiPriority="68" w:semiHidden="0" w:name="Medium Grid 2 Accent 5"/>
+    <w:lsdException w:unhideWhenUsed="0" w:uiPriority="69" w:semiHidden="0" w:name="Medium Grid 3 Accent 5"/>
+    <w:lsdException w:unhideWhenUsed="0" w:uiPriority="70" w:semiHidden="0" w:name="Dark List Accent 5"/>
+    <w:lsdException w:unhideWhenUsed="0" w:uiPriority="71" w:semiHidden="0" w:name="Colorful Shading Accent 5"/>
+    <w:lsdException w:unhideWhenUsed="0" w:uiPriority="72" w:semiHidden="0" w:name="Colorful List Accent 5"/>
+    <w:lsdException w:unhideWhenUsed="0" w:uiPriority="73" w:semiHidden="0" w:name="Colorful Grid Accent 5"/>
+    <w:lsdException w:unhideWhenUsed="0" w:uiPriority="60" w:semiHidden="0" w:name="Light Shading Accent 6"/>
+    <w:lsdException w:unhideWhenUsed="0" w:uiPriority="61" w:semiHidden="0" w:name="Light List Accent 6"/>
+    <w:lsdException w:unhideWhenUsed="0" w:uiPriority="62" w:semiHidden="0" w:name="Light Grid Accent 6"/>
+    <w:lsdException w:unhideWhenUsed="0" w:uiPriority="63" w:semiHidden="0" w:name="Medium Shading 1 Accent 6"/>
+    <w:lsdException w:unhideWhenUsed="0" w:uiPriority="64" w:semiHidden="0" w:name="Medium Shading 2 Accent 6"/>
+    <w:lsdException w:unhideWhenUsed="0" w:uiPriority="65" w:semiHidden="0" w:name="Medium List 1 Accent 6"/>
+    <w:lsdException w:unhideWhenUsed="0" w:uiPriority="66" w:semiHidden="0" w:name="Medium List 2 Accent 6"/>
+    <w:lsdException w:unhideWhenUsed="0" w:uiPriority="67" w:semiHidden="0" w:name="Medium Grid 1 Accent 6"/>
+    <w:lsdException w:unhideWhenUsed="0" w:uiPriority="68" w:semiHidden="0" w:name="Medium Grid 2 Accent 6"/>
+    <w:lsdException w:unhideWhenUsed="0" w:uiPriority="69" w:semiHidden="0" w:name="Medium Grid 3 Accent 6"/>
+    <w:lsdException w:unhideWhenUsed="0" w:uiPriority="70" w:semiHidden="0" w:name="Dark List Accent 6"/>
+    <w:lsdException w:unhideWhenUsed="0" w:uiPriority="71" w:semiHidden="0" w:name="Colorful Shading Accent 6"/>
+    <w:lsdException w:unhideWhenUsed="0" w:uiPriority="72" w:semiHidden="0" w:name="Colorful List Accent 6"/>
+    <w:lsdException w:unhideWhenUsed="0" w:uiPriority="73" w:semiHidden="0" w:name="Colorful Grid Accent 6"/>
+  </w:latentStyles>
+  <w:style w:type="paragraph" w:default="1" w:styleId="1">
     <w:name w:val="Normal"/>
     <w:qFormat/>
+    <w:uiPriority w:val="0"/>
+    <w:pPr>
+      <w:spacing w:before="0" w:after="120" w:line="300" w:lineRule="auto"/>
+    </w:pPr>
+    <w:rPr>
+      <w:rFonts w:ascii="Calibri" w:hAnsi="Calibri" w:eastAsia="微软雅黑" w:cs="Calibri"/>
+      <w:sz w:val="21"/>
+      <w:szCs w:val="21"/>
+    </w:rPr>
   </w:style>
-  <w:style w:type="paragraph" w:styleId="Heading1">
+  <w:style w:type="paragraph" w:styleId="2">
     <w:name w:val="heading 1"/>
-    <w:basedOn w:val="Normal"/>
+    <w:basedOn w:val="1"/>
     <w:qFormat/>
+    <w:uiPriority w:val="0"/>
     <w:pPr>
       <w:keepNext/>
       <w:spacing w:before="300" w:after="160"/>
@@ -1782,16 +2281,17 @@
       <w:szCs w:val="32"/>
     </w:rPr>
   </w:style>
-  <w:style w:type="paragraph" w:styleId="Heading2">
+  <w:style w:type="paragraph" w:styleId="3">
     <w:name w:val="heading 2"/>
-    <w:basedOn w:val="Normal"/>
+    <w:basedOn w:val="1"/>
     <w:qFormat/>
+    <w:uiPriority w:val="0"/>
     <w:pPr>
       <w:keepNext/>
+      <w:pBdr>
+        <w:bottom w:val="single" w:color="D0D7E5" w:sz="6" w:space="3"/>
+      </w:pBdr>
       <w:spacing w:before="280" w:after="130"/>
-      <w:pBdr>
-        <w:bottom w:val="single" w:sz="6" w:space="3" w:color="D0D7E5"/>
-      </w:pBdr>
       <w:outlineLvl w:val="1"/>
     </w:pPr>
     <w:rPr>
@@ -1801,10 +2301,11 @@
       <w:szCs w:val="26"/>
     </w:rPr>
   </w:style>
-  <w:style w:type="paragraph" w:styleId="Heading3">
+  <w:style w:type="paragraph" w:styleId="4">
     <w:name w:val="heading 3"/>
-    <w:basedOn w:val="Normal"/>
+    <w:basedOn w:val="1"/>
     <w:qFormat/>
+    <w:uiPriority w:val="0"/>
     <w:pPr>
       <w:keepNext/>
       <w:spacing w:before="220" w:after="110"/>
@@ -1817,15 +2318,35 @@
       <w:szCs w:val="23"/>
     </w:rPr>
   </w:style>
-  <w:style w:type="paragraph" w:styleId="Quote">
+  <w:style w:type="character" w:default="1" w:styleId="6">
+    <w:name w:val="Default Paragraph Font"/>
+    <w:semiHidden/>
+    <w:uiPriority w:val="0"/>
+  </w:style>
+  <w:style w:type="table" w:default="1" w:styleId="5">
+    <w:name w:val="Normal Table"/>
+    <w:semiHidden/>
+    <w:qFormat/>
+    <w:uiPriority w:val="0"/>
+    <w:tblPr>
+      <w:tblCellMar>
+        <w:top w:w="0" w:type="dxa"/>
+        <w:left w:w="108" w:type="dxa"/>
+        <w:bottom w:w="0" w:type="dxa"/>
+        <w:right w:w="108" w:type="dxa"/>
+      </w:tblCellMar>
+    </w:tblPr>
+  </w:style>
+  <w:style w:type="paragraph" w:styleId="7">
     <w:name w:val="Quote"/>
-    <w:basedOn w:val="Normal"/>
+    <w:basedOn w:val="1"/>
+    <w:uiPriority w:val="0"/>
     <w:pPr>
       <w:pBdr>
-        <w:left w:val="single" w:sz="18" w:space="10" w:color="C9CDD4"/>
+        <w:left w:val="single" w:color="C9CDD4" w:sz="18" w:space="10"/>
       </w:pBdr>
+      <w:spacing w:before="90" w:after="150"/>
       <w:ind w:left="284" w:right="284"/>
-      <w:spacing w:before="90" w:after="150"/>
     </w:pPr>
     <w:rPr>
       <w:color w:val="595959"/>
@@ -1833,13 +2354,14 @@
       <w:szCs w:val="20"/>
     </w:rPr>
   </w:style>
-  <w:style w:type="paragraph" w:styleId="Code">
+  <w:style w:type="paragraph" w:customStyle="1" w:styleId="8">
     <w:name w:val="Code"/>
-    <w:basedOn w:val="Normal"/>
+    <w:basedOn w:val="1"/>
+    <w:uiPriority w:val="0"/>
     <w:pPr>
       <w:shd w:val="clear" w:color="auto" w:fill="F6F7F9"/>
+      <w:spacing w:before="80" w:after="80" w:line="264" w:lineRule="auto"/>
       <w:ind w:left="227" w:right="227"/>
-      <w:spacing w:before="80" w:after="80" w:line="264" w:lineRule="auto"/>
     </w:pPr>
     <w:rPr>
       <w:rFonts w:ascii="Consolas" w:hAnsi="Consolas" w:eastAsia="Consolas"/>
@@ -1847,28 +2369,32 @@
       <w:szCs w:val="19"/>
     </w:rPr>
   </w:style>
-  <w:style w:type="paragraph" w:styleId="Check">
+  <w:style w:type="paragraph" w:customStyle="1" w:styleId="9">
     <w:name w:val="Check"/>
-    <w:basedOn w:val="Normal"/>
+    <w:basedOn w:val="1"/>
+    <w:qFormat/>
+    <w:uiPriority w:val="0"/>
     <w:pPr>
+      <w:spacing w:after="60"/>
       <w:ind w:left="454" w:hanging="284"/>
-      <w:spacing w:after="60"/>
     </w:pPr>
   </w:style>
-  <w:style w:type="paragraph" w:styleId="Bullet">
+  <w:style w:type="paragraph" w:customStyle="1" w:styleId="10">
     <w:name w:val="Bullet"/>
-    <w:basedOn w:val="Normal"/>
+    <w:basedOn w:val="1"/>
+    <w:uiPriority w:val="0"/>
     <w:pPr>
+      <w:spacing w:after="60"/>
       <w:ind w:left="454" w:hanging="284"/>
-      <w:spacing w:after="60"/>
     </w:pPr>
   </w:style>
-  <w:style w:type="paragraph" w:styleId="HR">
+  <w:style w:type="paragraph" w:customStyle="1" w:styleId="11">
     <w:name w:val="HR"/>
-    <w:basedOn w:val="Normal"/>
+    <w:basedOn w:val="1"/>
+    <w:uiPriority w:val="0"/>
     <w:pPr>
       <w:pBdr>
-        <w:bottom w:val="single" w:sz="6" w:space="1" w:color="D9D9D9"/>
+        <w:bottom w:val="single" w:color="D9D9D9" w:sz="6" w:space="1"/>
       </w:pBdr>
       <w:spacing w:before="80" w:after="150"/>
     </w:pPr>
@@ -1878,4 +2404,288 @@
     </w:rPr>
   </w:style>
 </w:styles>
+</file>
+
+<file path=word/theme/theme1.xml><?xml version="1.0" encoding="utf-8"?>
+<a:theme xmlns:a="http://schemas.openxmlformats.org/drawingml/2006/main" name="Office">
+  <a:themeElements>
+    <a:clrScheme name="Office">
+      <a:dk1>
+        <a:sysClr val="windowText" lastClr="000000"/>
+      </a:dk1>
+      <a:lt1>
+        <a:sysClr val="window" lastClr="FFFFFF"/>
+      </a:lt1>
+      <a:dk2>
+        <a:srgbClr val="1F497D"/>
+      </a:dk2>
+      <a:lt2>
+        <a:srgbClr val="EEECE1"/>
+      </a:lt2>
+      <a:accent1>
+        <a:srgbClr val="4F81BD"/>
+      </a:accent1>
+      <a:accent2>
+        <a:srgbClr val="C0504D"/>
+      </a:accent2>
+      <a:accent3>
+        <a:srgbClr val="9BBB59"/>
+      </a:accent3>
+      <a:accent4>
+        <a:srgbClr val="8064A2"/>
+      </a:accent4>
+      <a:accent5>
+        <a:srgbClr val="4BACC6"/>
+      </a:accent5>
+      <a:accent6>
+        <a:srgbClr val="F79646"/>
+      </a:accent6>
+      <a:hlink>
+        <a:srgbClr val="0000FF"/>
+      </a:hlink>
+      <a:folHlink>
+        <a:srgbClr val="800080"/>
+      </a:folHlink>
+    </a:clrScheme>
+    <a:fontScheme name="Office">
+      <a:majorFont>
+        <a:latin typeface="Cambria"/>
+        <a:ea typeface=""/>
+        <a:cs typeface=""/>
+        <a:font script="Jpan" typeface="游ゴシック Light"/>
+        <a:font script="Hang" typeface="맑은 고딕"/>
+        <a:font script="Hans" typeface="宋体"/>
+        <a:font script="Hant" typeface="新細明體"/>
+        <a:font script="Arab" typeface="Times New Roman"/>
+        <a:font script="Hebr" typeface="Times New Roman"/>
+        <a:font script="Thai" typeface="Angsana New"/>
+        <a:font script="Ethi" typeface="Nyala"/>
+        <a:font script="Beng" typeface="Vrinda"/>
+        <a:font script="Gujr" typeface="Shruti"/>
+        <a:font script="Khmr" typeface="MoolBoran"/>
+        <a:font script="Knda" typeface="Tunga"/>
+        <a:font script="Guru" typeface="Raavi"/>
+        <a:font script="Cans" typeface="Euphemia"/>
+        <a:font script="Cher" typeface="Plantagenet Cherokee"/>
+        <a:font script="Yiii" typeface="Microsoft Yi Baiti"/>
+        <a:font script="Tibt" typeface="Microsoft Himalaya"/>
+        <a:font script="Thaa" typeface="MV Boli"/>
+        <a:font script="Deva" typeface="Mangal"/>
+        <a:font script="Telu" typeface="Gautami"/>
+        <a:font script="Taml" typeface="Latha"/>
+        <a:font script="Syrc" typeface="Estrangelo Edessa"/>
+        <a:font script="Orya" typeface="Kalinga"/>
+        <a:font script="Mlym" typeface="Kartika"/>
+        <a:font script="Laoo" typeface="DokChampa"/>
+        <a:font script="Sinh" typeface="Iskoola Pota"/>
+        <a:font script="Mong" typeface="Mongolian Baiti"/>
+        <a:font script="Viet" typeface="Times New Roman"/>
+        <a:font script="Uigh" typeface="Microsoft Uighur"/>
+        <a:font script="Geor" typeface="Sylfaen"/>
+      </a:majorFont>
+      <a:minorFont>
+        <a:latin typeface="Calibri"/>
+        <a:ea typeface=""/>
+        <a:cs typeface=""/>
+        <a:font script="Jpan" typeface="游明朝"/>
+        <a:font script="Hang" typeface="맑은 고딕"/>
+        <a:font script="Hans" typeface="宋体"/>
+        <a:font script="Hant" typeface="新細明體"/>
+        <a:font script="Arab" typeface="Arial"/>
+        <a:font script="Hebr" typeface="Arial"/>
+        <a:font script="Thai" typeface="Cordia New"/>
+        <a:font script="Ethi" typeface="Nyala"/>
+        <a:font script="Beng" typeface="Vrinda"/>
+        <a:font script="Gujr" typeface="Shruti"/>
+        <a:font script="Khmr" typeface="DaunPenh"/>
+        <a:font script="Knda" typeface="Tunga"/>
+        <a:font script="Guru" typeface="Raavi"/>
+        <a:font script="Cans" typeface="Euphemia"/>
+        <a:font script="Cher" typeface="Plantagenet Cherokee"/>
+        <a:font script="Yiii" typeface="Microsoft Yi Baiti"/>
+        <a:font script="Tibt" typeface="Microsoft Himalaya"/>
+        <a:font script="Thaa" typeface="MV Boli"/>
+        <a:font script="Deva" typeface="Mangal"/>
+        <a:font script="Telu" typeface="Gautami"/>
+        <a:font script="Taml" typeface="Latha"/>
+        <a:font script="Syrc" typeface="Estrangelo Edessa"/>
+        <a:font script="Orya" typeface="Kalinga"/>
+        <a:font script="Mlym" typeface="Kartika"/>
+        <a:font script="Laoo" typeface="DokChampa"/>
+        <a:font script="Sinh" typeface="Iskoola Pota"/>
+        <a:font script="Mong" typeface="Mongolian Baiti"/>
+        <a:font script="Viet" typeface="Arial"/>
+        <a:font script="Uigh" typeface="Microsoft Uighur"/>
+        <a:font script="Geor" typeface="Sylfaen"/>
+      </a:minorFont>
+    </a:fontScheme>
+    <a:fmtScheme name="Office">
+      <a:fillStyleLst>
+        <a:solidFill>
+          <a:schemeClr val="phClr"/>
+        </a:solidFill>
+        <a:gradFill rotWithShape="1">
+          <a:gsLst>
+            <a:gs pos="0">
+              <a:schemeClr val="phClr">
+                <a:tint val="50000"/>
+                <a:satMod val="300000"/>
+              </a:schemeClr>
+            </a:gs>
+            <a:gs pos="35000">
+              <a:schemeClr val="phClr">
+                <a:tint val="37000"/>
+                <a:satMod val="300000"/>
+              </a:schemeClr>
+            </a:gs>
+            <a:gs pos="100000">
+              <a:schemeClr val="phClr">
+                <a:tint val="15000"/>
+                <a:satMod val="350000"/>
+              </a:schemeClr>
+            </a:gs>
+          </a:gsLst>
+          <a:lin ang="16200000" scaled="1"/>
+        </a:gradFill>
+        <a:gradFill rotWithShape="1">
+          <a:gsLst>
+            <a:gs pos="0">
+              <a:schemeClr val="phClr">
+                <a:shade val="51000"/>
+                <a:satMod val="130000"/>
+              </a:schemeClr>
+            </a:gs>
+            <a:gs pos="80000">
+              <a:schemeClr val="phClr">
+                <a:shade val="93000"/>
+                <a:satMod val="130000"/>
+              </a:schemeClr>
+            </a:gs>
+            <a:gs pos="100000">
+              <a:schemeClr val="phClr">
+                <a:shade val="94000"/>
+                <a:satMod val="135000"/>
+              </a:schemeClr>
+            </a:gs>
+          </a:gsLst>
+          <a:lin ang="16200000" scaled="0"/>
+        </a:gradFill>
+      </a:fillStyleLst>
+      <a:lnStyleLst>
+        <a:ln w="9525" cap="flat" cmpd="sng" algn="ctr">
+          <a:solidFill>
+            <a:schemeClr val="phClr">
+              <a:shade val="95000"/>
+              <a:satMod val="105000"/>
+            </a:schemeClr>
+          </a:solidFill>
+          <a:prstDash val="solid"/>
+        </a:ln>
+        <a:ln w="25400" cap="flat" cmpd="sng" algn="ctr">
+          <a:solidFill>
+            <a:schemeClr val="phClr"/>
+          </a:solidFill>
+          <a:prstDash val="solid"/>
+        </a:ln>
+        <a:ln w="38100" cap="flat" cmpd="sng" algn="ctr">
+          <a:solidFill>
+            <a:schemeClr val="phClr"/>
+          </a:solidFill>
+          <a:prstDash val="solid"/>
+        </a:ln>
+      </a:lnStyleLst>
+      <a:effectStyleLst>
+        <a:effectStyle>
+          <a:effectLst>
+            <a:outerShdw blurRad="40000" dist="20000" dir="5400000" rotWithShape="0">
+              <a:srgbClr val="000000">
+                <a:alpha val="38000"/>
+              </a:srgbClr>
+            </a:outerShdw>
+          </a:effectLst>
+        </a:effectStyle>
+        <a:effectStyle>
+          <a:effectLst>
+            <a:outerShdw blurRad="40000" dist="23000" dir="5400000" rotWithShape="0">
+              <a:srgbClr val="000000">
+                <a:alpha val="35000"/>
+              </a:srgbClr>
+            </a:outerShdw>
+          </a:effectLst>
+        </a:effectStyle>
+        <a:effectStyle>
+          <a:effectLst>
+            <a:outerShdw blurRad="40000" dist="23000" dir="5400000" rotWithShape="0">
+              <a:srgbClr val="000000">
+                <a:alpha val="35000"/>
+              </a:srgbClr>
+            </a:outerShdw>
+          </a:effectLst>
+          <a:scene3d>
+            <a:camera prst="orthographicFront">
+              <a:rot lat="0" lon="0" rev="0"/>
+            </a:camera>
+            <a:lightRig rig="threePt" dir="t">
+              <a:rot lat="0" lon="0" rev="1200000"/>
+            </a:lightRig>
+          </a:scene3d>
+          <a:sp3d>
+            <a:bevelT w="63500" h="25400"/>
+          </a:sp3d>
+        </a:effectStyle>
+      </a:effectStyleLst>
+      <a:bgFillStyleLst>
+        <a:solidFill>
+          <a:schemeClr val="phClr"/>
+        </a:solidFill>
+        <a:gradFill rotWithShape="1">
+          <a:gsLst>
+            <a:gs pos="0">
+              <a:schemeClr val="phClr">
+                <a:tint val="40000"/>
+                <a:satMod val="350000"/>
+              </a:schemeClr>
+            </a:gs>
+            <a:gs pos="40000">
+              <a:schemeClr val="phClr">
+                <a:tint val="45000"/>
+                <a:satMod val="350000"/>
+                <a:shade val="99000"/>
+              </a:schemeClr>
+            </a:gs>
+            <a:gs pos="100000">
+              <a:schemeClr val="phClr">
+                <a:shade val="20000"/>
+                <a:satMod val="255000"/>
+              </a:schemeClr>
+            </a:gs>
+          </a:gsLst>
+          <a:path path="circle">
+            <a:fillToRect l="50000" t="-80000" r="50000" b="180000"/>
+          </a:path>
+        </a:gradFill>
+        <a:gradFill rotWithShape="1">
+          <a:gsLst>
+            <a:gs pos="0">
+              <a:schemeClr val="phClr">
+                <a:tint val="80000"/>
+                <a:satMod val="300000"/>
+              </a:schemeClr>
+            </a:gs>
+            <a:gs pos="100000">
+              <a:schemeClr val="phClr">
+                <a:shade val="30000"/>
+                <a:satMod val="200000"/>
+              </a:schemeClr>
+            </a:gs>
+          </a:gsLst>
+          <a:path path="circle">
+            <a:fillToRect l="50000" t="50000" r="50000" b="50000"/>
+          </a:path>
+        </a:gradFill>
+      </a:bgFillStyleLst>
+    </a:fmtScheme>
+  </a:themeElements>
+  <a:objectDefaults/>
+</a:theme>
 </file>
</xml_diff>